<commit_message>
feat: Add mini-game, vouchers, updated Vietnamese product datasets, and orders management
</commit_message>
<xml_diff>
--- a/TaiLieu_Chuong2_Chuong3.docx
+++ b/TaiLieu_Chuong2_Chuong3.docx
@@ -187,7 +187,7 @@
           </w:tcPr>
           <w:p>
             <w:r>
-              <w:t>Đặt hàng &amp; Thanh toán</w:t>
+              <w:t>Áp dụng mã giảm giá (Voucher)</w:t>
             </w:r>
           </w:p>
         </w:tc>
@@ -197,7 +197,7 @@
           </w:tcPr>
           <w:p>
             <w:r>
-              <w:t>Chọn địa chỉ giao hàng, chọn phương thức thanh toán (COD, MoMo, Chuyển khoản). Hệ thống tự sinh mã đơn hàng dạng OD + timestamp, gửi email xác nhận đơn hàng tự động.</w:t>
+              <w:t>Nhập mã giảm giá tại trang thanh toán. Hệ thống kiểm tra mã hợp lệ (còn hiệu lực, chưa hết lượt dùng, đơn đủ giá trị tối thiểu). Hỗ trợ 2 loại: giảm tiền trực tiếp (fixed) và giảm phần trăm (percent). Hiển thị rõ tạm tính, số tiền giảm, và thành tiền sau giảm.</w:t>
             </w:r>
           </w:p>
         </w:tc>
@@ -209,7 +209,7 @@
           </w:tcPr>
           <w:p>
             <w:r>
-              <w:t>Theo dõi đơn hàng</w:t>
+              <w:t>Đặt hàng &amp; Thanh toán</w:t>
             </w:r>
           </w:p>
         </w:tc>
@@ -219,7 +219,7 @@
           </w:tcPr>
           <w:p>
             <w:r>
-              <w:t>Xem lịch sử đơn hàng với phân trang, lọc theo trạng thái (chờ xử lý, đang xử lý, đang giao, hoàn thành, đã hủy), xem chi tiết từng đơn, xuất hoá đơn PDF.</w:t>
+              <w:t>Chọn địa chỉ giao hàng, chọn phương thức thanh toán (COD, MoMo, Chuyển khoản). Hệ thống tự sinh mã đơn hàng dạng OD + timestamp, áp dụng voucher giảm giá nếu có, gửi email xác nhận đơn hàng tự động.</w:t>
             </w:r>
           </w:p>
         </w:tc>
@@ -231,7 +231,7 @@
           </w:tcPr>
           <w:p>
             <w:r>
-              <w:t>Quản lý địa chỉ</w:t>
+              <w:t>Theo dõi đơn hàng</w:t>
             </w:r>
           </w:p>
         </w:tc>
@@ -241,7 +241,7 @@
           </w:tcPr>
           <w:p>
             <w:r>
-              <w:t>Thêm/sửa/xóa nhiều địa chỉ giao hàng, đặt địa chỉ mặc định. Tích hợp API GHN để lấy danh sách Tỉnh/Thành → Quận/Huyện → Phường/Xã tự động.</w:t>
+              <w:t>Xem lịch sử đơn hàng với phân trang, lọc theo trạng thái (chờ xử lý, đang xử lý, đang giao, hoàn thành, đã hủy), xem chi tiết từng đơn, xuất hoá đơn PDF.</w:t>
             </w:r>
           </w:p>
         </w:tc>
@@ -253,7 +253,7 @@
           </w:tcPr>
           <w:p>
             <w:r>
-              <w:t>Sản phẩm yêu thích</w:t>
+              <w:t>Quản lý địa chỉ</w:t>
             </w:r>
           </w:p>
         </w:tc>
@@ -263,7 +263,7 @@
           </w:tcPr>
           <w:p>
             <w:r>
-              <w:t>Lưu/bỏ lưu sản phẩm yêu thích vào LocalStorage (không cần đăng nhập), xem trang danh sách sản phẩm yêu thích riêng. Icon trái tim hiển thị trên mọi card sản phẩm.</w:t>
+              <w:t>Thêm/sửa/xóa nhiều địa chỉ giao hàng, đặt địa chỉ mặc định. Tích hợp API GHN để lấy danh sách Tỉnh/Thành → Quận/Huyện → Phường/Xã tự động.</w:t>
             </w:r>
           </w:p>
         </w:tc>
@@ -275,7 +275,7 @@
           </w:tcPr>
           <w:p>
             <w:r>
-              <w:t>Trợ lý AI tư vấn</w:t>
+              <w:t>Sản phẩm yêu thích</w:t>
             </w:r>
           </w:p>
         </w:tc>
@@ -285,7 +285,7 @@
           </w:tcPr>
           <w:p>
             <w:r>
-              <w:t>Chatbot AI tư vấn mua sắm tích hợp Google Gemini API, gợi ý sản phẩm dựa trên ngữ cảnh hội thoại và dữ liệu thực từ CSDL. Lịch sử chat lưu LocalStorage, giới hạn 20 lượt/phiên.</w:t>
+              <w:t>Lưu/bỏ lưu sản phẩm yêu thích vào LocalStorage (không cần đăng nhập), xem trang danh sách sản phẩm yêu thích riêng. Icon trái tim hiển thị trên mọi card sản phẩm.</w:t>
             </w:r>
           </w:p>
         </w:tc>
@@ -297,6 +297,28 @@
           </w:tcPr>
           <w:p>
             <w:r>
+              <w:t>Trợ lý AI tư vấn</w:t>
+            </w:r>
+          </w:p>
+        </w:tc>
+        <w:tc>
+          <w:tcPr>
+            <w:tcW w:type="dxa" w:w="4320"/>
+          </w:tcPr>
+          <w:p>
+            <w:r>
+              <w:t>Chatbot AI tư vấn mua sắm tích hợp Google Gemini API, gợi ý sản phẩm dựa trên ngữ cảnh hội thoại và dữ liệu thực từ CSDL. Lịch sử chat lưu LocalStorage, giới hạn 20 lượt/phiên.</w:t>
+            </w:r>
+          </w:p>
+        </w:tc>
+      </w:tr>
+      <w:tr>
+        <w:tc>
+          <w:tcPr>
+            <w:tcW w:type="dxa" w:w="4320"/>
+          </w:tcPr>
+          <w:p>
+            <w:r>
               <w:t>Đổi mật khẩu &amp; Hồ sơ</w:t>
             </w:r>
           </w:p>
@@ -308,6 +330,28 @@
           <w:p>
             <w:r>
               <w:t>Xem và cập nhật thông tin cá nhân (họ tên, SĐT), đổi mật khẩu với xác minh mật khẩu cũ.</w:t>
+            </w:r>
+          </w:p>
+        </w:tc>
+      </w:tr>
+      <w:tr>
+        <w:tc>
+          <w:tcPr>
+            <w:tcW w:type="dxa" w:w="4320"/>
+          </w:tcPr>
+          <w:p>
+            <w:r>
+              <w:t>Game Lắc Hũ nhận Voucher</w:t>
+            </w:r>
+          </w:p>
+        </w:tc>
+        <w:tc>
+          <w:tcPr>
+            <w:tcW w:type="dxa" w:w="4320"/>
+          </w:tcPr>
+          <w:p>
+            <w:r>
+              <w:t>Chơi mini quiz Đúng/Sai hàng ngày (5 câu miễn phí/ngày + bonus từ mua hàng). Trả lời đúng 3 câu liên tiếp (streak) → kích hoạt animation lắc hũ → xác suất trúng voucher theo % cấu hình. Giao diện: progress bar streak, animation lắc hũ, hiển thị mã voucher khi trúng.</w:t>
             </w:r>
           </w:p>
         </w:tc>
@@ -498,6 +542,50 @@
           </w:tcPr>
           <w:p>
             <w:r>
+              <w:t>Quản lý Mã giảm giá (Voucher)</w:t>
+            </w:r>
+          </w:p>
+        </w:tc>
+        <w:tc>
+          <w:tcPr>
+            <w:tcW w:type="dxa" w:w="4320"/>
+          </w:tcPr>
+          <w:p>
+            <w:r>
+              <w:t>CRUD mã giảm giá. Cấu hình: mã code (unique), loại giảm (percent/fixed), mức giảm, đơn tối thiểu áp dụng, thời hạn (start_date/end_date), giới hạn lượt dùng (usage_limit), bật/tắt kích hoạt. Theo dõi số lượt đã dùng (used_count).</w:t>
+            </w:r>
+          </w:p>
+        </w:tc>
+      </w:tr>
+      <w:tr>
+        <w:tc>
+          <w:tcPr>
+            <w:tcW w:type="dxa" w:w="4320"/>
+          </w:tcPr>
+          <w:p>
+            <w:r>
+              <w:t>Quản lý Game Lắc Hũ</w:t>
+            </w:r>
+          </w:p>
+        </w:tc>
+        <w:tc>
+          <w:tcPr>
+            <w:tcW w:type="dxa" w:w="4320"/>
+          </w:tcPr>
+          <w:p>
+            <w:r>
+              <w:t>Cấu hình game: bật/tắt (game_enabled), số câu hỏi/ngày (daily_questions), số câu đúng liên tiếp để lắc hũ (streak_required), tỷ lệ trúng % (win_probability), chọn voucher thưởng (game_voucher_id). CRUD ngân hàng câu hỏi Đúng/Sai với giải thích.</w:t>
+            </w:r>
+          </w:p>
+        </w:tc>
+      </w:tr>
+      <w:tr>
+        <w:tc>
+          <w:tcPr>
+            <w:tcW w:type="dxa" w:w="4320"/>
+          </w:tcPr>
+          <w:p>
+            <w:r>
               <w:t>Quản lý Section trang chủ</w:t>
             </w:r>
           </w:p>
@@ -597,7 +685,7 @@
       <w:r>
         <w:drawing>
           <wp:inline xmlns:a="http://schemas.openxmlformats.org/drawingml/2006/main" xmlns:pic="http://schemas.openxmlformats.org/drawingml/2006/picture">
-            <wp:extent cx="5486400" cy="18261686"/>
+            <wp:extent cx="5486400" cy="20998308"/>
             <wp:docPr id="1" name="Picture 1"/>
             <wp:cNvGraphicFramePr>
               <a:graphicFrameLocks noChangeAspect="1"/>
@@ -618,7 +706,7 @@
                   <pic:spPr>
                     <a:xfrm>
                       <a:off x="0" y="0"/>
-                      <a:ext cx="5486400" cy="18261686"/>
+                      <a:ext cx="5486400" cy="20998308"/>
                     </a:xfrm>
                     <a:prstGeom prst="rect"/>
                   </pic:spPr>
@@ -1402,6 +1490,110 @@
           </w:p>
         </w:tc>
       </w:tr>
+      <w:tr>
+        <w:tc>
+          <w:tcPr>
+            <w:tcW w:type="dxa" w:w="1728"/>
+          </w:tcPr>
+          <w:p>
+            <w:r>
+              <w:t>Áp dụng mã giảm giá</w:t>
+            </w:r>
+          </w:p>
+        </w:tc>
+        <w:tc>
+          <w:tcPr>
+            <w:tcW w:type="dxa" w:w="1728"/>
+          </w:tcPr>
+          <w:p>
+            <w:r>
+              <w:t>Khách hàng</w:t>
+            </w:r>
+          </w:p>
+        </w:tc>
+        <w:tc>
+          <w:tcPr>
+            <w:tcW w:type="dxa" w:w="1728"/>
+          </w:tcPr>
+          <w:p>
+            <w:r>
+              <w:t>Nhập mã voucher tại trang checkout để được giảm giá đơn hàng.</w:t>
+            </w:r>
+          </w:p>
+        </w:tc>
+        <w:tc>
+          <w:tcPr>
+            <w:tcW w:type="dxa" w:w="1728"/>
+          </w:tcPr>
+          <w:p>
+            <w:r>
+              <w:t>Đã đăng nhập, có giỏ hàng</w:t>
+            </w:r>
+          </w:p>
+        </w:tc>
+        <w:tc>
+          <w:tcPr>
+            <w:tcW w:type="dxa" w:w="1728"/>
+          </w:tcPr>
+          <w:p>
+            <w:r>
+              <w:t>Nhập mã code → POST /cart/voucher → Voucher::where(code) → isValidForAmount(total) kiểm tra: is_active, usage_limit, start_date/end_date, min_order_amount → Lưu voucher vào session → Hiển thị số tiền giảm.</w:t>
+            </w:r>
+          </w:p>
+        </w:tc>
+      </w:tr>
+      <w:tr>
+        <w:tc>
+          <w:tcPr>
+            <w:tcW w:type="dxa" w:w="1728"/>
+          </w:tcPr>
+          <w:p>
+            <w:r>
+              <w:t>Chơi Game Lắc Hũ</w:t>
+            </w:r>
+          </w:p>
+        </w:tc>
+        <w:tc>
+          <w:tcPr>
+            <w:tcW w:type="dxa" w:w="1728"/>
+          </w:tcPr>
+          <w:p>
+            <w:r>
+              <w:t>Khách hàng</w:t>
+            </w:r>
+          </w:p>
+        </w:tc>
+        <w:tc>
+          <w:tcPr>
+            <w:tcW w:type="dxa" w:w="1728"/>
+          </w:tcPr>
+          <w:p>
+            <w:r>
+              <w:t>Chơi mini quiz Đúng/Sai để nhận cơ hội lắc hũ trúng voucher.</w:t>
+            </w:r>
+          </w:p>
+        </w:tc>
+        <w:tc>
+          <w:tcPr>
+            <w:tcW w:type="dxa" w:w="1728"/>
+          </w:tcPr>
+          <w:p>
+            <w:r>
+              <w:t>Đã đăng nhập, game đang bật</w:t>
+            </w:r>
+          </w:p>
+        </w:tc>
+        <w:tc>
+          <w:tcPr>
+            <w:tcW w:type="dxa" w:w="1728"/>
+          </w:tcPr>
+          <w:p>
+            <w:r>
+              <w:t>GET /game → firstOrCreate GameSession → fetch random QuizQuestion → trả lời Đúng/Sai → đúng: streak+1, sai: streak=0 → đủ streak → lắc hũ → rand(1,100) &lt;= win_probability → trúng: nhận voucher code.</w:t>
+            </w:r>
+          </w:p>
+        </w:tc>
+      </w:tr>
     </w:tbl>
     <w:p>
       <w:pPr>
@@ -1423,7 +1615,7 @@
       <w:r>
         <w:drawing>
           <wp:inline xmlns:a="http://schemas.openxmlformats.org/drawingml/2006/main" xmlns:pic="http://schemas.openxmlformats.org/drawingml/2006/picture">
-            <wp:extent cx="5486400" cy="15974007"/>
+            <wp:extent cx="5486400" cy="19855543"/>
             <wp:docPr id="2" name="Picture 2"/>
             <wp:cNvGraphicFramePr>
               <a:graphicFrameLocks noChangeAspect="1"/>
@@ -1444,7 +1636,7 @@
                   <pic:spPr>
                     <a:xfrm>
                       <a:off x="0" y="0"/>
-                      <a:ext cx="5486400" cy="15974007"/>
+                      <a:ext cx="5486400" cy="19855543"/>
                     </a:xfrm>
                     <a:prstGeom prst="rect"/>
                   </pic:spPr>
@@ -1844,6 +2036,70 @@
           </w:p>
         </w:tc>
       </w:tr>
+      <w:tr>
+        <w:tc>
+          <w:tcPr>
+            <w:tcW w:type="dxa" w:w="2880"/>
+          </w:tcPr>
+          <w:p>
+            <w:r>
+              <w:t>Quản lý Mã giảm giá</w:t>
+            </w:r>
+          </w:p>
+        </w:tc>
+        <w:tc>
+          <w:tcPr>
+            <w:tcW w:type="dxa" w:w="2880"/>
+          </w:tcPr>
+          <w:p>
+            <w:r>
+              <w:t>CRUD mã voucher giảm giá cho khách hàng.</w:t>
+            </w:r>
+          </w:p>
+        </w:tc>
+        <w:tc>
+          <w:tcPr>
+            <w:tcW w:type="dxa" w:w="2880"/>
+          </w:tcPr>
+          <w:p>
+            <w:r>
+              <w:t>Index: paginate 10, hiển thị code/mức giảm/điều kiện/thời hạn/lượt dùng. Create/Store: validate code unique + discount_type + discount_value + min_order_amount + start_date/end_date + usage_limit + is_active. Edit/Update: sửa thông tin. Destroy: xóa voucher.</w:t>
+            </w:r>
+          </w:p>
+        </w:tc>
+      </w:tr>
+      <w:tr>
+        <w:tc>
+          <w:tcPr>
+            <w:tcW w:type="dxa" w:w="2880"/>
+          </w:tcPr>
+          <w:p>
+            <w:r>
+              <w:t>Quản lý Game Lắc Hũ</w:t>
+            </w:r>
+          </w:p>
+        </w:tc>
+        <w:tc>
+          <w:tcPr>
+            <w:tcW w:type="dxa" w:w="2880"/>
+          </w:tcPr>
+          <w:p>
+            <w:r>
+              <w:t>Cấu hình và CRUD câu hỏi quiz cho game tặng voucher.</w:t>
+            </w:r>
+          </w:p>
+        </w:tc>
+        <w:tc>
+          <w:tcPr>
+            <w:tcW w:type="dxa" w:w="2880"/>
+          </w:tcPr>
+          <w:p>
+            <w:r>
+              <w:t>index: load GameConfig (5 key). update: set game_enabled, daily_questions, streak_required, win_probability, game_voucher_id. questions: paginate 10 QuizQuestion. storeQuestion/updateQuestion: validate question + is_correct_true + explanation + is_active. destroyQuestion: xóa.</w:t>
+            </w:r>
+          </w:p>
+        </w:tc>
+      </w:tr>
     </w:tbl>
     <w:p>
       <w:pPr>
@@ -1865,7 +2121,7 @@
       <w:r>
         <w:drawing>
           <wp:inline xmlns:a="http://schemas.openxmlformats.org/drawingml/2006/main" xmlns:pic="http://schemas.openxmlformats.org/drawingml/2006/picture">
-            <wp:extent cx="5486400" cy="418091"/>
+            <wp:extent cx="5486400" cy="351558"/>
             <wp:docPr id="3" name="Picture 3"/>
             <wp:cNvGraphicFramePr>
               <a:graphicFrameLocks noChangeAspect="1"/>
@@ -1886,7 +2142,7 @@
                   <pic:spPr>
                     <a:xfrm>
                       <a:off x="0" y="0"/>
-                      <a:ext cx="5486400" cy="418091"/>
+                      <a:ext cx="5486400" cy="351558"/>
                     </a:xfrm>
                     <a:prstGeom prst="rect"/>
                   </pic:spPr>
@@ -2479,6 +2735,195 @@
           <w:p>
             <w:r>
               <w:t>index: load all key-value. update: updateOrCreate cho site_name, site_description, logo, bank_bin, bank_name, bank_account_no, bank_account_name.</w:t>
+            </w:r>
+          </w:p>
+        </w:tc>
+      </w:tr>
+      <w:tr>
+        <w:tc>
+          <w:tcPr>
+            <w:tcW w:type="dxa" w:w="2880"/>
+          </w:tcPr>
+          <w:p>
+            <w:r>
+              <w:t>QL Mã giảm giá</w:t>
+            </w:r>
+          </w:p>
+        </w:tc>
+        <w:tc>
+          <w:tcPr>
+            <w:tcW w:type="dxa" w:w="2880"/>
+          </w:tcPr>
+          <w:p>
+            <w:r>
+              <w:t>Admin\VoucherController</w:t>
+            </w:r>
+          </w:p>
+        </w:tc>
+        <w:tc>
+          <w:tcPr>
+            <w:tcW w:type="dxa" w:w="2880"/>
+          </w:tcPr>
+          <w:p>
+            <w:r>
+              <w:t>CRUD đầy đủ. Store: validate code unique, discount_type (percent/fixed), discount_value, min_order_amount, start_date/end_date, usage_limit, is_active. Index: paginate 10, hiển thị used_count/usage_limit. Destroy: xóa voucher.</w:t>
+            </w:r>
+          </w:p>
+        </w:tc>
+      </w:tr>
+      <w:tr>
+        <w:tc>
+          <w:tcPr>
+            <w:tcW w:type="dxa" w:w="2880"/>
+          </w:tcPr>
+          <w:p>
+            <w:r>
+              <w:t>QL Game Lắc Hũ</w:t>
+            </w:r>
+          </w:p>
+        </w:tc>
+        <w:tc>
+          <w:tcPr>
+            <w:tcW w:type="dxa" w:w="2880"/>
+          </w:tcPr>
+          <w:p>
+            <w:r>
+              <w:t>Admin\GameController</w:t>
+            </w:r>
+          </w:p>
+        </w:tc>
+        <w:tc>
+          <w:tcPr>
+            <w:tcW w:type="dxa" w:w="2880"/>
+          </w:tcPr>
+          <w:p>
+            <w:r>
+              <w:t>index: load 5 GameConfig key-value + danh sách vouchers active. update: validate + GameConfig::set() cho 5 cấu hình. questions: paginate 10. storeQuestion/updateQuestion/destroyQuestion: CRUD QuizQuestion.</w:t>
+            </w:r>
+          </w:p>
+        </w:tc>
+      </w:tr>
+    </w:tbl>
+    <w:p>
+      <w:pPr>
+        <w:pStyle w:val="Heading4"/>
+      </w:pPr>
+      <w:r>
+        <w:t>Phân hệ Game Tương tác</w:t>
+      </w:r>
+    </w:p>
+    <w:tbl>
+      <w:tblPr>
+        <w:tblStyle w:val="TableGrid"/>
+        <w:tblW w:type="auto" w:w="0"/>
+        <w:tblLook w:firstColumn="1" w:firstRow="1" w:lastColumn="0" w:lastRow="0" w:noHBand="0" w:noVBand="1" w:val="04A0"/>
+      </w:tblPr>
+      <w:tblGrid>
+        <w:gridCol w:w="2880"/>
+        <w:gridCol w:w="2880"/>
+        <w:gridCol w:w="2880"/>
+      </w:tblGrid>
+      <w:tr>
+        <w:tc>
+          <w:tcPr>
+            <w:tcW w:type="dxa" w:w="2880"/>
+          </w:tcPr>
+          <w:p>
+            <w:r>
+              <w:rPr>
+                <w:b/>
+              </w:rPr>
+              <w:t>Chức năng</w:t>
+            </w:r>
+          </w:p>
+        </w:tc>
+        <w:tc>
+          <w:tcPr>
+            <w:tcW w:type="dxa" w:w="2880"/>
+          </w:tcPr>
+          <w:p>
+            <w:r>
+              <w:rPr>
+                <w:b/>
+              </w:rPr>
+              <w:t>Controller xử lý</w:t>
+            </w:r>
+          </w:p>
+        </w:tc>
+        <w:tc>
+          <w:tcPr>
+            <w:tcW w:type="dxa" w:w="2880"/>
+          </w:tcPr>
+          <w:p>
+            <w:r>
+              <w:rPr>
+                <w:b/>
+              </w:rPr>
+              <w:t>Mô tả nghiệp vụ</w:t>
+            </w:r>
+          </w:p>
+        </w:tc>
+      </w:tr>
+      <w:tr>
+        <w:tc>
+          <w:tcPr>
+            <w:tcW w:type="dxa" w:w="2880"/>
+          </w:tcPr>
+          <w:p>
+            <w:r>
+              <w:t>Game Lắc Hũ (Client)</w:t>
+            </w:r>
+          </w:p>
+        </w:tc>
+        <w:tc>
+          <w:tcPr>
+            <w:tcW w:type="dxa" w:w="2880"/>
+          </w:tcPr>
+          <w:p>
+            <w:r>
+              <w:t>Client\GameController</w:t>
+            </w:r>
+          </w:p>
+        </w:tc>
+        <w:tc>
+          <w:tcPr>
+            <w:tcW w:type="dxa" w:w="2880"/>
+          </w:tcPr>
+          <w:p>
+            <w:r>
+              <w:t>index: kiểm tra game_enabled → firstOrCreate GameSession (user_id + today). getQuestion: query QuizQuestion active random, trả JSON. answerQuestion: so sánh is_correct_true == answer → đúng: streak+1, sai: streak=0. shakeJar: kiểm tra streak &gt;= streak_required → rand(1,100) &lt;= win_probability → trúng: trả voucher code.</w:t>
+            </w:r>
+          </w:p>
+        </w:tc>
+      </w:tr>
+      <w:tr>
+        <w:tc>
+          <w:tcPr>
+            <w:tcW w:type="dxa" w:w="2880"/>
+          </w:tcPr>
+          <w:p>
+            <w:r>
+              <w:t>Bonus câu hỏi</w:t>
+            </w:r>
+          </w:p>
+        </w:tc>
+        <w:tc>
+          <w:tcPr>
+            <w:tcW w:type="dxa" w:w="2880"/>
+          </w:tcPr>
+          <w:p>
+            <w:r>
+              <w:t>Admin\OrderController</w:t>
+            </w:r>
+          </w:p>
+        </w:tc>
+        <w:tc>
+          <w:tcPr>
+            <w:tcW w:type="dxa" w:w="2880"/>
+          </w:tcPr>
+          <w:p>
+            <w:r>
+              <w:t>Khi đơn chuyển status=completed → tăng bonus_questions trong game_sessions của user → khách có thêm lượt chơi.</w:t>
             </w:r>
           </w:p>
         </w:tc>
@@ -3351,7 +3796,7 @@
         <w:t xml:space="preserve">Bước 1: </w:t>
       </w:r>
       <w:r>
-        <w:t>Khách hàng ở trang /checkout chọn địa chỉ giao hàng (shipping_address_id), phương thức thanh toán (payment_method: cod/momo/bank_transfer), và nhập ghi chú (notes).</w:t>
+        <w:t>Khách hàng ở trang /checkout chọn địa chỉ giao hàng (shipping_address_id), phương thức thanh toán (payment_method: cod/momo/bank_transfer), và nhập ghi chú (notes). Có thể nhập mã giảm giá (voucher) trước khi đặt hàng.</w:t>
       </w:r>
     </w:p>
     <w:p>
@@ -3384,7 +3829,7 @@
         <w:t xml:space="preserve">Bước 4: </w:t>
       </w:r>
       <w:r>
-        <w:t>Tính tổng tiền total_amount = Σ(price × quantity) cho tất cả sản phẩm trong giỏ.</w:t>
+        <w:t>Tính tổng tiền total = Σ(price × quantity) cho tất cả sản phẩm trong giỏ.</w:t>
       </w:r>
     </w:p>
     <w:p>
@@ -3395,7 +3840,7 @@
         <w:t xml:space="preserve">Bước 5: </w:t>
       </w:r>
       <w:r>
-        <w:t>Tạo bản ghi Order: order_number = "OD" + date("YmdHis") + random digits (đảm bảo unique), status = "pending", payment_status = "pending".</w:t>
+        <w:t>Kiểm tra voucher trong session: Nếu có voucher → gọi $voucher-&gt;isValidForAmount($total) kiểm tra hợp lệ → gọi $voucher-&gt;calculateDiscount($total) tính số tiền giảm (percent: total × value/100, fixed: value) → finalTotal = total - discountAmount → increment used_count.</w:t>
       </w:r>
     </w:p>
     <w:p>
@@ -3406,7 +3851,7 @@
         <w:t xml:space="preserve">Bước 6: </w:t>
       </w:r>
       <w:r>
-        <w:t>Vòng lặp tạo OrderItem cho mỗi sản phẩm trong giỏ: ghi nhận order_id, product_id, quantity, price (giá tại thời điểm mua), subtotal = price × quantity.</w:t>
+        <w:t>Tạo bản ghi Order: order_number = "OD" + date("YmdHis") + random digits, status = "pending", payment_status = "pending", total_amount = finalTotal (sau giảm), voucher_id = voucher.id nếu có, discount_amount = số tiền được giảm.</w:t>
       </w:r>
     </w:p>
     <w:p>
@@ -3417,7 +3862,7 @@
         <w:t xml:space="preserve">Bước 7: </w:t>
       </w:r>
       <w:r>
-        <w:t>Xóa session cart: session()-&gt;forget("cart"). Giỏ hàng trở về trống.</w:t>
+        <w:t>Vòng lặp tạo OrderItem cho mỗi sản phẩm trong giỏ: ghi nhận order_id, product_id, quantity, price (giá tại thời điểm mua), subtotal = price × quantity.</w:t>
       </w:r>
     </w:p>
     <w:p>
@@ -3428,7 +3873,7 @@
         <w:t xml:space="preserve">Bước 8: </w:t>
       </w:r>
       <w:r>
-        <w:t>Gửi email xác nhận đơn hàng tự động qua Mail::to($user)-&gt;send(new OrderPlaced($order)).</w:t>
+        <w:t>Xóa session cart VÀ session voucher: session()-&gt;forget(["cart", "voucher"]). Giỏ hàng và mã giảm giá trở về trống.</w:t>
       </w:r>
     </w:p>
     <w:p>
@@ -3437,6 +3882,17 @@
           <w:b/>
         </w:rPr>
         <w:t xml:space="preserve">Bước 9: </w:t>
+      </w:r>
+      <w:r>
+        <w:t>Gửi email xác nhận đơn hàng tự động qua Mail::to($user)-&gt;send(new OrderPlaced($order)).</w:t>
+      </w:r>
+    </w:p>
+    <w:p>
+      <w:r>
+        <w:rPr>
+          <w:b/>
+        </w:rPr>
+        <w:t xml:space="preserve">Bước 10: </w:t>
       </w:r>
       <w:r>
         <w:t>Redirect theo phương thức thanh toán: MoMo → /payment/momo/{order_id}, Chuyển khoản → /payment/bank/{order_id}, COD → /orders/{order_id} (trang chi tiết đơn).</w:t>
@@ -4050,6 +4506,152 @@
     </w:p>
     <w:p>
       <w:pPr>
+        <w:pStyle w:val="Heading3"/>
+      </w:pPr>
+      <w:r>
+        <w:t>3.2.9. Sơ đồ tuần tự - Game Lắc Hũ nhận Voucher</w:t>
+      </w:r>
+    </w:p>
+    <w:p>
+      <w:r>
+        <w:t>Mô tả luồng chơi game mini quiz từ khi khách hàng vào trang game đến khi lắc hũ nhận kết quả:</w:t>
+      </w:r>
+    </w:p>
+    <w:p>
+      <w:pPr>
+        <w:jc w:val="center"/>
+      </w:pPr>
+      <w:r>
+        <w:drawing>
+          <wp:inline xmlns:a="http://schemas.openxmlformats.org/drawingml/2006/main" xmlns:pic="http://schemas.openxmlformats.org/drawingml/2006/picture">
+            <wp:extent cx="5486400" cy="6382069"/>
+            <wp:docPr id="13" name="Picture 13"/>
+            <wp:cNvGraphicFramePr>
+              <a:graphicFrameLocks noChangeAspect="1"/>
+            </wp:cNvGraphicFramePr>
+            <a:graphic>
+              <a:graphicData uri="http://schemas.openxmlformats.org/drawingml/2006/picture">
+                <pic:pic>
+                  <pic:nvPicPr>
+                    <pic:cNvPr id="0" name="d18.png"/>
+                    <pic:cNvPicPr/>
+                  </pic:nvPicPr>
+                  <pic:blipFill>
+                    <a:blip r:embed="rId21"/>
+                    <a:stretch>
+                      <a:fillRect/>
+                    </a:stretch>
+                  </pic:blipFill>
+                  <pic:spPr>
+                    <a:xfrm>
+                      <a:off x="0" y="0"/>
+                      <a:ext cx="5486400" cy="6382069"/>
+                    </a:xfrm>
+                    <a:prstGeom prst="rect"/>
+                  </pic:spPr>
+                </pic:pic>
+              </a:graphicData>
+            </a:graphic>
+          </wp:inline>
+        </w:drawing>
+      </w:r>
+    </w:p>
+    <w:p>
+      <w:pPr>
+        <w:jc w:val="center"/>
+      </w:pPr>
+      <w:r>
+        <w:rPr>
+          <w:i/>
+          <w:sz w:val="20"/>
+        </w:rPr>
+        <w:t>Hình: Sơ đồ tuần tự - Game Lắc Hũ</w:t>
+      </w:r>
+    </w:p>
+    <w:p>
+      <w:r>
+        <w:t>Mô tả chi tiết từng bước:</w:t>
+      </w:r>
+    </w:p>
+    <w:p>
+      <w:r>
+        <w:rPr>
+          <w:b/>
+        </w:rPr>
+        <w:t xml:space="preserve">Bước 1: </w:t>
+      </w:r>
+      <w:r>
+        <w:t>Khách hàng đã đăng nhập truy cập /game. GameController kiểm tra game_enabled từ bảng game_configs. Nếu tắt → redirect về trang chủ.</w:t>
+      </w:r>
+    </w:p>
+    <w:p>
+      <w:r>
+        <w:rPr>
+          <w:b/>
+        </w:rPr>
+        <w:t xml:space="preserve">Bước 2: </w:t>
+      </w:r>
+      <w:r>
+        <w:t>Tạo hoặc lấy GameSession::firstOrCreate(user_id + today): đảm bảo mỗi user chỉ có 1 phiên chơi/ngày. Hiển thị: lượt còn lại, streak hiện tại, progress bar ngôi sao.</w:t>
+      </w:r>
+    </w:p>
+    <w:p>
+      <w:r>
+        <w:rPr>
+          <w:b/>
+        </w:rPr>
+        <w:t xml:space="preserve">Bước 3: </w:t>
+      </w:r>
+      <w:r>
+        <w:t>Nhấn "Bắt đầu": POST /game/question. Controller kiểm tra canPlay() (còn lượt chơi không). Lấy câu hỏi ngẫu nhiên từ QuizQuestion::active()-&gt;inRandomOrder()-&gt;first().</w:t>
+      </w:r>
+    </w:p>
+    <w:p>
+      <w:r>
+        <w:rPr>
+          <w:b/>
+        </w:rPr>
+        <w:t xml:space="preserve">Bước 4: </w:t>
+      </w:r>
+      <w:r>
+        <w:t>Khách chọn "Đúng" hoặc "Sai": POST /game/answer. So sánh với is_correct_true: đúng → correct_streak += 1, sai → correct_streak = 0. Cập nhật questions_answered += 1.</w:t>
+      </w:r>
+    </w:p>
+    <w:p>
+      <w:r>
+        <w:rPr>
+          <w:b/>
+        </w:rPr>
+        <w:t xml:space="preserve">Bước 5: </w:t>
+      </w:r>
+      <w:r>
+        <w:t>Nếu correct_streak &gt;= streak_required (mặc định 3): can_shake = true. Client ẩn khu vực câu hỏi, hiển animation hũ quà với CSS @keyframes shake.</w:t>
+      </w:r>
+    </w:p>
+    <w:p>
+      <w:r>
+        <w:rPr>
+          <w:b/>
+        </w:rPr>
+        <w:t xml:space="preserve">Bước 6: </w:t>
+      </w:r>
+      <w:r>
+        <w:t>Khách nhấn vào hũ: animation shake 2 giây → POST /game/shake. Server reset streak = 0, tạo rand(1,100). Nếu &lt;= win_probability → trúng.</w:t>
+      </w:r>
+    </w:p>
+    <w:p>
+      <w:r>
+        <w:rPr>
+          <w:b/>
+        </w:rPr>
+        <w:t xml:space="preserve">Bước 7: </w:t>
+      </w:r>
+      <w:r>
+        <w:t>Trúng: kiểm tra voucher (game_voucher_id) còn hợp lệ (is_active + usage_limit). Trả về mã voucher code → client hiển mã + nút sao chép. Không trúng: hiển "Chúc may mắn lần sau", quay lại chơi nếu còn lượt.</w:t>
+      </w:r>
+    </w:p>
+    <w:p>
+      <w:pPr>
         <w:pStyle w:val="Heading2"/>
       </w:pPr>
       <w:r>
@@ -4077,7 +4679,7 @@
         <w:drawing>
           <wp:inline xmlns:a="http://schemas.openxmlformats.org/drawingml/2006/main" xmlns:pic="http://schemas.openxmlformats.org/drawingml/2006/picture">
             <wp:extent cx="5486400" cy="5905127"/>
-            <wp:docPr id="13" name="Picture 13"/>
+            <wp:docPr id="14" name="Picture 14"/>
             <wp:cNvGraphicFramePr>
               <a:graphicFrameLocks noChangeAspect="1"/>
             </wp:cNvGraphicFramePr>
@@ -4089,7 +4691,7 @@
                     <pic:cNvPicPr/>
                   </pic:nvPicPr>
                   <pic:blipFill>
-                    <a:blip r:embed="rId21"/>
+                    <a:blip r:embed="rId22"/>
                     <a:stretch>
                       <a:fillRect/>
                     </a:stretch>
@@ -4359,7 +4961,7 @@
         <w:drawing>
           <wp:inline xmlns:a="http://schemas.openxmlformats.org/drawingml/2006/main" xmlns:pic="http://schemas.openxmlformats.org/drawingml/2006/picture">
             <wp:extent cx="5486400" cy="4443211"/>
-            <wp:docPr id="14" name="Picture 14"/>
+            <wp:docPr id="15" name="Picture 15"/>
             <wp:cNvGraphicFramePr>
               <a:graphicFrameLocks noChangeAspect="1"/>
             </wp:cNvGraphicFramePr>
@@ -4371,7 +4973,7 @@
                     <pic:cNvPicPr/>
                   </pic:nvPicPr>
                   <pic:blipFill>
-                    <a:blip r:embed="rId22"/>
+                    <a:blip r:embed="rId23"/>
                     <a:stretch>
                       <a:fillRect/>
                     </a:stretch>
@@ -4616,8 +5218,8 @@
       <w:r>
         <w:drawing>
           <wp:inline xmlns:a="http://schemas.openxmlformats.org/drawingml/2006/main" xmlns:pic="http://schemas.openxmlformats.org/drawingml/2006/picture">
-            <wp:extent cx="5486400" cy="3674737"/>
-            <wp:docPr id="15" name="Picture 15"/>
+            <wp:extent cx="5486400" cy="2561504"/>
+            <wp:docPr id="16" name="Picture 16"/>
             <wp:cNvGraphicFramePr>
               <a:graphicFrameLocks noChangeAspect="1"/>
             </wp:cNvGraphicFramePr>
@@ -4629,7 +5231,7 @@
                     <pic:cNvPicPr/>
                   </pic:nvPicPr>
                   <pic:blipFill>
-                    <a:blip r:embed="rId23"/>
+                    <a:blip r:embed="rId24"/>
                     <a:stretch>
                       <a:fillRect/>
                     </a:stretch>
@@ -4637,7 +5239,7 @@
                   <pic:spPr>
                     <a:xfrm>
                       <a:off x="0" y="0"/>
-                      <a:ext cx="5486400" cy="3674737"/>
+                      <a:ext cx="5486400" cy="2561504"/>
                     </a:xfrm>
                     <a:prstGeom prst="rect"/>
                   </pic:spPr>
@@ -5255,6 +5857,130 @@
           </w:p>
         </w:tc>
       </w:tr>
+      <w:tr>
+        <w:tc>
+          <w:tcPr>
+            <w:tcW w:type="dxa" w:w="1440"/>
+          </w:tcPr>
+          <w:p>
+            <w:r>
+              <w:t>Voucher - Order</w:t>
+            </w:r>
+          </w:p>
+        </w:tc>
+        <w:tc>
+          <w:tcPr>
+            <w:tcW w:type="dxa" w:w="1440"/>
+          </w:tcPr>
+          <w:p>
+            <w:r>
+              <w:t>vouchers</w:t>
+            </w:r>
+          </w:p>
+        </w:tc>
+        <w:tc>
+          <w:tcPr>
+            <w:tcW w:type="dxa" w:w="1440"/>
+          </w:tcPr>
+          <w:p>
+            <w:r>
+              <w:t>orders</w:t>
+            </w:r>
+          </w:p>
+        </w:tc>
+        <w:tc>
+          <w:tcPr>
+            <w:tcW w:type="dxa" w:w="1440"/>
+          </w:tcPr>
+          <w:p>
+            <w:r>
+              <w:t>1:N</w:t>
+            </w:r>
+          </w:p>
+        </w:tc>
+        <w:tc>
+          <w:tcPr>
+            <w:tcW w:type="dxa" w:w="1440"/>
+          </w:tcPr>
+          <w:p>
+            <w:r>
+              <w:t>orders.voucher_id → vouchers.id (NULL ON DELETE)</w:t>
+            </w:r>
+          </w:p>
+        </w:tc>
+        <w:tc>
+          <w:tcPr>
+            <w:tcW w:type="dxa" w:w="1440"/>
+          </w:tcPr>
+          <w:p>
+            <w:r>
+              <w:t>Một mã giảm giá có thể được sử dụng cho nhiều đơn hàng. Xóa voucher → set null.</w:t>
+            </w:r>
+          </w:p>
+        </w:tc>
+      </w:tr>
+      <w:tr>
+        <w:tc>
+          <w:tcPr>
+            <w:tcW w:type="dxa" w:w="1440"/>
+          </w:tcPr>
+          <w:p>
+            <w:r>
+              <w:t>User - GameSession</w:t>
+            </w:r>
+          </w:p>
+        </w:tc>
+        <w:tc>
+          <w:tcPr>
+            <w:tcW w:type="dxa" w:w="1440"/>
+          </w:tcPr>
+          <w:p>
+            <w:r>
+              <w:t>users</w:t>
+            </w:r>
+          </w:p>
+        </w:tc>
+        <w:tc>
+          <w:tcPr>
+            <w:tcW w:type="dxa" w:w="1440"/>
+          </w:tcPr>
+          <w:p>
+            <w:r>
+              <w:t>game_sessions</w:t>
+            </w:r>
+          </w:p>
+        </w:tc>
+        <w:tc>
+          <w:tcPr>
+            <w:tcW w:type="dxa" w:w="1440"/>
+          </w:tcPr>
+          <w:p>
+            <w:r>
+              <w:t>1:N</w:t>
+            </w:r>
+          </w:p>
+        </w:tc>
+        <w:tc>
+          <w:tcPr>
+            <w:tcW w:type="dxa" w:w="1440"/>
+          </w:tcPr>
+          <w:p>
+            <w:r>
+              <w:t>game_sessions.user_id → users.id CASCADE</w:t>
+            </w:r>
+          </w:p>
+        </w:tc>
+        <w:tc>
+          <w:tcPr>
+            <w:tcW w:type="dxa" w:w="1440"/>
+          </w:tcPr>
+          <w:p>
+            <w:r>
+              <w:t>Một user có nhiều phiên chơi game (1 phiên/ngày). Xóa user → cascade xóa sessions. UNIQUE(user_id, date).</w:t>
+            </w:r>
+          </w:p>
+        </w:tc>
+      </w:tr>
     </w:tbl>
     <w:p>
       <w:pPr>
@@ -7121,7 +7847,91 @@
           </w:tcPr>
           <w:p>
             <w:r>
-              <w:t>Tổng tiền</w:t>
+              <w:t>Tổng tiền (sau giảm giá)</w:t>
+            </w:r>
+          </w:p>
+        </w:tc>
+      </w:tr>
+      <w:tr>
+        <w:tc>
+          <w:tcPr>
+            <w:tcW w:type="dxa" w:w="2160"/>
+          </w:tcPr>
+          <w:p>
+            <w:r>
+              <w:t>voucher_id</w:t>
+            </w:r>
+          </w:p>
+        </w:tc>
+        <w:tc>
+          <w:tcPr>
+            <w:tcW w:type="dxa" w:w="2160"/>
+          </w:tcPr>
+          <w:p>
+            <w:r>
+              <w:t>BIGINT UNSIGNED</w:t>
+            </w:r>
+          </w:p>
+        </w:tc>
+        <w:tc>
+          <w:tcPr>
+            <w:tcW w:type="dxa" w:w="2160"/>
+          </w:tcPr>
+          <w:p>
+            <w:r>
+              <w:t>FK → vouchers.id NULL ON DELETE, NULLABLE</w:t>
+            </w:r>
+          </w:p>
+        </w:tc>
+        <w:tc>
+          <w:tcPr>
+            <w:tcW w:type="dxa" w:w="2160"/>
+          </w:tcPr>
+          <w:p>
+            <w:r>
+              <w:t>Mã giảm giá đã áp dụng</w:t>
+            </w:r>
+          </w:p>
+        </w:tc>
+      </w:tr>
+      <w:tr>
+        <w:tc>
+          <w:tcPr>
+            <w:tcW w:type="dxa" w:w="2160"/>
+          </w:tcPr>
+          <w:p>
+            <w:r>
+              <w:t>discount_amount</w:t>
+            </w:r>
+          </w:p>
+        </w:tc>
+        <w:tc>
+          <w:tcPr>
+            <w:tcW w:type="dxa" w:w="2160"/>
+          </w:tcPr>
+          <w:p>
+            <w:r>
+              <w:t>DECIMAL(12,2)</w:t>
+            </w:r>
+          </w:p>
+        </w:tc>
+        <w:tc>
+          <w:tcPr>
+            <w:tcW w:type="dxa" w:w="2160"/>
+          </w:tcPr>
+          <w:p>
+            <w:r>
+              <w:t>DEFAULT 0</w:t>
+            </w:r>
+          </w:p>
+        </w:tc>
+        <w:tc>
+          <w:tcPr>
+            <w:tcW w:type="dxa" w:w="2160"/>
+          </w:tcPr>
+          <w:p>
+            <w:r>
+              <w:t>Số tiền được giảm</w:t>
             </w:r>
           </w:p>
         </w:tc>
@@ -9179,73 +9989,13 @@
         </w:tc>
       </w:tr>
     </w:tbl>
+    <w:p/>
     <w:p>
       <w:pPr>
-        <w:pStyle w:val="Heading3"/>
+        <w:pStyle w:val="IntenseQuote"/>
       </w:pPr>
       <w:r>
-        <w:t>3.4.3. Sơ đồ lớp (Class Diagram) - Quan hệ Model</w:t>
-      </w:r>
-    </w:p>
-    <w:p>
-      <w:r>
-        <w:t>Sơ đồ lớp thể hiện 7 Eloquent Model chính và các mối quan hệ giữa chúng (belongsTo, hasMany):</w:t>
-      </w:r>
-    </w:p>
-    <w:p>
-      <w:pPr>
-        <w:jc w:val="center"/>
-      </w:pPr>
-      <w:r>
-        <w:drawing>
-          <wp:inline xmlns:a="http://schemas.openxmlformats.org/drawingml/2006/main" xmlns:pic="http://schemas.openxmlformats.org/drawingml/2006/picture">
-            <wp:extent cx="5486400" cy="4531743"/>
-            <wp:docPr id="16" name="Picture 16"/>
-            <wp:cNvGraphicFramePr>
-              <a:graphicFrameLocks noChangeAspect="1"/>
-            </wp:cNvGraphicFramePr>
-            <a:graphic>
-              <a:graphicData uri="http://schemas.openxmlformats.org/drawingml/2006/picture">
-                <pic:pic>
-                  <pic:nvPicPr>
-                    <pic:cNvPr id="0" name="d16.png"/>
-                    <pic:cNvPicPr/>
-                  </pic:nvPicPr>
-                  <pic:blipFill>
-                    <a:blip r:embed="rId24"/>
-                    <a:stretch>
-                      <a:fillRect/>
-                    </a:stretch>
-                  </pic:blipFill>
-                  <pic:spPr>
-                    <a:xfrm>
-                      <a:off x="0" y="0"/>
-                      <a:ext cx="5486400" cy="4531743"/>
-                    </a:xfrm>
-                    <a:prstGeom prst="rect"/>
-                  </pic:spPr>
-                </pic:pic>
-              </a:graphicData>
-            </a:graphic>
-          </wp:inline>
-        </w:drawing>
-      </w:r>
-    </w:p>
-    <w:p>
-      <w:pPr>
-        <w:jc w:val="center"/>
-      </w:pPr>
-      <w:r>
-        <w:rPr>
-          <w:i/>
-          <w:sz w:val="20"/>
-        </w:rPr>
-        <w:t>Hình: Sơ đồ lớp - Quan hệ Model Eloquent</w:t>
-      </w:r>
-    </w:p>
-    <w:p>
-      <w:r>
-        <w:t>Mô tả các quan hệ trong Class Diagram:</w:t>
+        <w:t>Bảng vouchers - Mã giảm giá (Voucher):</w:t>
       </w:r>
     </w:p>
     <w:tbl>
@@ -9270,6 +10020,1504 @@
               <w:rPr>
                 <w:b/>
               </w:rPr>
+              <w:t>Tên cột</w:t>
+            </w:r>
+          </w:p>
+        </w:tc>
+        <w:tc>
+          <w:tcPr>
+            <w:tcW w:type="dxa" w:w="2160"/>
+          </w:tcPr>
+          <w:p>
+            <w:r>
+              <w:rPr>
+                <w:b/>
+              </w:rPr>
+              <w:t>Kiểu dữ liệu</w:t>
+            </w:r>
+          </w:p>
+        </w:tc>
+        <w:tc>
+          <w:tcPr>
+            <w:tcW w:type="dxa" w:w="2160"/>
+          </w:tcPr>
+          <w:p>
+            <w:r>
+              <w:rPr>
+                <w:b/>
+              </w:rPr>
+              <w:t>Ràng buộc</w:t>
+            </w:r>
+          </w:p>
+        </w:tc>
+        <w:tc>
+          <w:tcPr>
+            <w:tcW w:type="dxa" w:w="2160"/>
+          </w:tcPr>
+          <w:p>
+            <w:r>
+              <w:rPr>
+                <w:b/>
+              </w:rPr>
+              <w:t>Mô tả</w:t>
+            </w:r>
+          </w:p>
+        </w:tc>
+      </w:tr>
+      <w:tr>
+        <w:tc>
+          <w:tcPr>
+            <w:tcW w:type="dxa" w:w="2160"/>
+          </w:tcPr>
+          <w:p>
+            <w:r>
+              <w:t>id</w:t>
+            </w:r>
+          </w:p>
+        </w:tc>
+        <w:tc>
+          <w:tcPr>
+            <w:tcW w:type="dxa" w:w="2160"/>
+          </w:tcPr>
+          <w:p>
+            <w:r>
+              <w:t>BIGINT UNSIGNED</w:t>
+            </w:r>
+          </w:p>
+        </w:tc>
+        <w:tc>
+          <w:tcPr>
+            <w:tcW w:type="dxa" w:w="2160"/>
+          </w:tcPr>
+          <w:p>
+            <w:r>
+              <w:t>PK, AUTO_INCREMENT</w:t>
+            </w:r>
+          </w:p>
+        </w:tc>
+        <w:tc>
+          <w:tcPr>
+            <w:tcW w:type="dxa" w:w="2160"/>
+          </w:tcPr>
+          <w:p>
+            <w:r>
+              <w:t>Khóa chính</w:t>
+            </w:r>
+          </w:p>
+        </w:tc>
+      </w:tr>
+      <w:tr>
+        <w:tc>
+          <w:tcPr>
+            <w:tcW w:type="dxa" w:w="2160"/>
+          </w:tcPr>
+          <w:p>
+            <w:r>
+              <w:t>code</w:t>
+            </w:r>
+          </w:p>
+        </w:tc>
+        <w:tc>
+          <w:tcPr>
+            <w:tcW w:type="dxa" w:w="2160"/>
+          </w:tcPr>
+          <w:p>
+            <w:r>
+              <w:t>VARCHAR(255)</w:t>
+            </w:r>
+          </w:p>
+        </w:tc>
+        <w:tc>
+          <w:tcPr>
+            <w:tcW w:type="dxa" w:w="2160"/>
+          </w:tcPr>
+          <w:p>
+            <w:r>
+              <w:t>UNIQUE, NOT NULL</w:t>
+            </w:r>
+          </w:p>
+        </w:tc>
+        <w:tc>
+          <w:tcPr>
+            <w:tcW w:type="dxa" w:w="2160"/>
+          </w:tcPr>
+          <w:p>
+            <w:r>
+              <w:t>Mã code giảm giá (VD: SALE50, GIAM10K)</w:t>
+            </w:r>
+          </w:p>
+        </w:tc>
+      </w:tr>
+      <w:tr>
+        <w:tc>
+          <w:tcPr>
+            <w:tcW w:type="dxa" w:w="2160"/>
+          </w:tcPr>
+          <w:p>
+            <w:r>
+              <w:t>discount_type</w:t>
+            </w:r>
+          </w:p>
+        </w:tc>
+        <w:tc>
+          <w:tcPr>
+            <w:tcW w:type="dxa" w:w="2160"/>
+          </w:tcPr>
+          <w:p>
+            <w:r>
+              <w:t>ENUM(percent, fixed)</w:t>
+            </w:r>
+          </w:p>
+        </w:tc>
+        <w:tc>
+          <w:tcPr>
+            <w:tcW w:type="dxa" w:w="2160"/>
+          </w:tcPr>
+          <w:p>
+            <w:r>
+              <w:t>DEFAULT fixed</w:t>
+            </w:r>
+          </w:p>
+        </w:tc>
+        <w:tc>
+          <w:tcPr>
+            <w:tcW w:type="dxa" w:w="2160"/>
+          </w:tcPr>
+          <w:p>
+            <w:r>
+              <w:t>Loại giảm: percent = %, fixed = tiền trực tiếp</w:t>
+            </w:r>
+          </w:p>
+        </w:tc>
+      </w:tr>
+      <w:tr>
+        <w:tc>
+          <w:tcPr>
+            <w:tcW w:type="dxa" w:w="2160"/>
+          </w:tcPr>
+          <w:p>
+            <w:r>
+              <w:t>discount_value</w:t>
+            </w:r>
+          </w:p>
+        </w:tc>
+        <w:tc>
+          <w:tcPr>
+            <w:tcW w:type="dxa" w:w="2160"/>
+          </w:tcPr>
+          <w:p>
+            <w:r>
+              <w:t>DECIMAL(12,2)</w:t>
+            </w:r>
+          </w:p>
+        </w:tc>
+        <w:tc>
+          <w:tcPr>
+            <w:tcW w:type="dxa" w:w="2160"/>
+          </w:tcPr>
+          <w:p>
+            <w:r>
+              <w:t>NOT NULL</w:t>
+            </w:r>
+          </w:p>
+        </w:tc>
+        <w:tc>
+          <w:tcPr>
+            <w:tcW w:type="dxa" w:w="2160"/>
+          </w:tcPr>
+          <w:p>
+            <w:r>
+              <w:t>Mức giảm: VD 10 (= 10%) hoặc 50000 (= 50.000đ)</w:t>
+            </w:r>
+          </w:p>
+        </w:tc>
+      </w:tr>
+      <w:tr>
+        <w:tc>
+          <w:tcPr>
+            <w:tcW w:type="dxa" w:w="2160"/>
+          </w:tcPr>
+          <w:p>
+            <w:r>
+              <w:t>min_order_amount</w:t>
+            </w:r>
+          </w:p>
+        </w:tc>
+        <w:tc>
+          <w:tcPr>
+            <w:tcW w:type="dxa" w:w="2160"/>
+          </w:tcPr>
+          <w:p>
+            <w:r>
+              <w:t>DECIMAL(12,2)</w:t>
+            </w:r>
+          </w:p>
+        </w:tc>
+        <w:tc>
+          <w:tcPr>
+            <w:tcW w:type="dxa" w:w="2160"/>
+          </w:tcPr>
+          <w:p>
+            <w:r>
+              <w:t>DEFAULT 0</w:t>
+            </w:r>
+          </w:p>
+        </w:tc>
+        <w:tc>
+          <w:tcPr>
+            <w:tcW w:type="dxa" w:w="2160"/>
+          </w:tcPr>
+          <w:p>
+            <w:r>
+              <w:t>Giá trị đơn tối thiểu để áp dụng mã</w:t>
+            </w:r>
+          </w:p>
+        </w:tc>
+      </w:tr>
+      <w:tr>
+        <w:tc>
+          <w:tcPr>
+            <w:tcW w:type="dxa" w:w="2160"/>
+          </w:tcPr>
+          <w:p>
+            <w:r>
+              <w:t>start_date</w:t>
+            </w:r>
+          </w:p>
+        </w:tc>
+        <w:tc>
+          <w:tcPr>
+            <w:tcW w:type="dxa" w:w="2160"/>
+          </w:tcPr>
+          <w:p>
+            <w:r>
+              <w:t>DATETIME</w:t>
+            </w:r>
+          </w:p>
+        </w:tc>
+        <w:tc>
+          <w:tcPr>
+            <w:tcW w:type="dxa" w:w="2160"/>
+          </w:tcPr>
+          <w:p>
+            <w:r>
+              <w:t>NULLABLE</w:t>
+            </w:r>
+          </w:p>
+        </w:tc>
+        <w:tc>
+          <w:tcPr>
+            <w:tcW w:type="dxa" w:w="2160"/>
+          </w:tcPr>
+          <w:p>
+            <w:r>
+              <w:t>Ngày bắt đầu hiệu lực</w:t>
+            </w:r>
+          </w:p>
+        </w:tc>
+      </w:tr>
+      <w:tr>
+        <w:tc>
+          <w:tcPr>
+            <w:tcW w:type="dxa" w:w="2160"/>
+          </w:tcPr>
+          <w:p>
+            <w:r>
+              <w:t>end_date</w:t>
+            </w:r>
+          </w:p>
+        </w:tc>
+        <w:tc>
+          <w:tcPr>
+            <w:tcW w:type="dxa" w:w="2160"/>
+          </w:tcPr>
+          <w:p>
+            <w:r>
+              <w:t>DATETIME</w:t>
+            </w:r>
+          </w:p>
+        </w:tc>
+        <w:tc>
+          <w:tcPr>
+            <w:tcW w:type="dxa" w:w="2160"/>
+          </w:tcPr>
+          <w:p>
+            <w:r>
+              <w:t>NULLABLE</w:t>
+            </w:r>
+          </w:p>
+        </w:tc>
+        <w:tc>
+          <w:tcPr>
+            <w:tcW w:type="dxa" w:w="2160"/>
+          </w:tcPr>
+          <w:p>
+            <w:r>
+              <w:t>Ngày hết hạn</w:t>
+            </w:r>
+          </w:p>
+        </w:tc>
+      </w:tr>
+      <w:tr>
+        <w:tc>
+          <w:tcPr>
+            <w:tcW w:type="dxa" w:w="2160"/>
+          </w:tcPr>
+          <w:p>
+            <w:r>
+              <w:t>usage_limit</w:t>
+            </w:r>
+          </w:p>
+        </w:tc>
+        <w:tc>
+          <w:tcPr>
+            <w:tcW w:type="dxa" w:w="2160"/>
+          </w:tcPr>
+          <w:p>
+            <w:r>
+              <w:t>INTEGER</w:t>
+            </w:r>
+          </w:p>
+        </w:tc>
+        <w:tc>
+          <w:tcPr>
+            <w:tcW w:type="dxa" w:w="2160"/>
+          </w:tcPr>
+          <w:p>
+            <w:r>
+              <w:t>NULLABLE</w:t>
+            </w:r>
+          </w:p>
+        </w:tc>
+        <w:tc>
+          <w:tcPr>
+            <w:tcW w:type="dxa" w:w="2160"/>
+          </w:tcPr>
+          <w:p>
+            <w:r>
+              <w:t>Số lượt dùng tối đa (NULL = vô hạn)</w:t>
+            </w:r>
+          </w:p>
+        </w:tc>
+      </w:tr>
+      <w:tr>
+        <w:tc>
+          <w:tcPr>
+            <w:tcW w:type="dxa" w:w="2160"/>
+          </w:tcPr>
+          <w:p>
+            <w:r>
+              <w:t>used_count</w:t>
+            </w:r>
+          </w:p>
+        </w:tc>
+        <w:tc>
+          <w:tcPr>
+            <w:tcW w:type="dxa" w:w="2160"/>
+          </w:tcPr>
+          <w:p>
+            <w:r>
+              <w:t>INTEGER</w:t>
+            </w:r>
+          </w:p>
+        </w:tc>
+        <w:tc>
+          <w:tcPr>
+            <w:tcW w:type="dxa" w:w="2160"/>
+          </w:tcPr>
+          <w:p>
+            <w:r>
+              <w:t>DEFAULT 0</w:t>
+            </w:r>
+          </w:p>
+        </w:tc>
+        <w:tc>
+          <w:tcPr>
+            <w:tcW w:type="dxa" w:w="2160"/>
+          </w:tcPr>
+          <w:p>
+            <w:r>
+              <w:t>Số lượt đã sử dụng</w:t>
+            </w:r>
+          </w:p>
+        </w:tc>
+      </w:tr>
+      <w:tr>
+        <w:tc>
+          <w:tcPr>
+            <w:tcW w:type="dxa" w:w="2160"/>
+          </w:tcPr>
+          <w:p>
+            <w:r>
+              <w:t>is_active</w:t>
+            </w:r>
+          </w:p>
+        </w:tc>
+        <w:tc>
+          <w:tcPr>
+            <w:tcW w:type="dxa" w:w="2160"/>
+          </w:tcPr>
+          <w:p>
+            <w:r>
+              <w:t>BOOLEAN</w:t>
+            </w:r>
+          </w:p>
+        </w:tc>
+        <w:tc>
+          <w:tcPr>
+            <w:tcW w:type="dxa" w:w="2160"/>
+          </w:tcPr>
+          <w:p>
+            <w:r>
+              <w:t>DEFAULT true</w:t>
+            </w:r>
+          </w:p>
+        </w:tc>
+        <w:tc>
+          <w:tcPr>
+            <w:tcW w:type="dxa" w:w="2160"/>
+          </w:tcPr>
+          <w:p>
+            <w:r>
+              <w:t>Trạng thái kích hoạt</w:t>
+            </w:r>
+          </w:p>
+        </w:tc>
+      </w:tr>
+    </w:tbl>
+    <w:p/>
+    <w:p>
+      <w:pPr>
+        <w:pStyle w:val="IntenseQuote"/>
+      </w:pPr>
+      <w:r>
+        <w:t>Bảng quiz_questions - Ngân hàng câu hỏi Quiz:</w:t>
+      </w:r>
+    </w:p>
+    <w:tbl>
+      <w:tblPr>
+        <w:tblStyle w:val="TableGrid"/>
+        <w:tblW w:type="auto" w:w="0"/>
+        <w:tblLook w:firstColumn="1" w:firstRow="1" w:lastColumn="0" w:lastRow="0" w:noHBand="0" w:noVBand="1" w:val="04A0"/>
+      </w:tblPr>
+      <w:tblGrid>
+        <w:gridCol w:w="2160"/>
+        <w:gridCol w:w="2160"/>
+        <w:gridCol w:w="2160"/>
+        <w:gridCol w:w="2160"/>
+      </w:tblGrid>
+      <w:tr>
+        <w:tc>
+          <w:tcPr>
+            <w:tcW w:type="dxa" w:w="2160"/>
+          </w:tcPr>
+          <w:p>
+            <w:r>
+              <w:rPr>
+                <w:b/>
+              </w:rPr>
+              <w:t>Tên cột</w:t>
+            </w:r>
+          </w:p>
+        </w:tc>
+        <w:tc>
+          <w:tcPr>
+            <w:tcW w:type="dxa" w:w="2160"/>
+          </w:tcPr>
+          <w:p>
+            <w:r>
+              <w:rPr>
+                <w:b/>
+              </w:rPr>
+              <w:t>Kiểu dữ liệu</w:t>
+            </w:r>
+          </w:p>
+        </w:tc>
+        <w:tc>
+          <w:tcPr>
+            <w:tcW w:type="dxa" w:w="2160"/>
+          </w:tcPr>
+          <w:p>
+            <w:r>
+              <w:rPr>
+                <w:b/>
+              </w:rPr>
+              <w:t>Ràng buộc</w:t>
+            </w:r>
+          </w:p>
+        </w:tc>
+        <w:tc>
+          <w:tcPr>
+            <w:tcW w:type="dxa" w:w="2160"/>
+          </w:tcPr>
+          <w:p>
+            <w:r>
+              <w:rPr>
+                <w:b/>
+              </w:rPr>
+              <w:t>Mô tả</w:t>
+            </w:r>
+          </w:p>
+        </w:tc>
+      </w:tr>
+      <w:tr>
+        <w:tc>
+          <w:tcPr>
+            <w:tcW w:type="dxa" w:w="2160"/>
+          </w:tcPr>
+          <w:p>
+            <w:r>
+              <w:t>id</w:t>
+            </w:r>
+          </w:p>
+        </w:tc>
+        <w:tc>
+          <w:tcPr>
+            <w:tcW w:type="dxa" w:w="2160"/>
+          </w:tcPr>
+          <w:p>
+            <w:r>
+              <w:t>BIGINT UNSIGNED</w:t>
+            </w:r>
+          </w:p>
+        </w:tc>
+        <w:tc>
+          <w:tcPr>
+            <w:tcW w:type="dxa" w:w="2160"/>
+          </w:tcPr>
+          <w:p>
+            <w:r>
+              <w:t>PK, AUTO_INCREMENT</w:t>
+            </w:r>
+          </w:p>
+        </w:tc>
+        <w:tc>
+          <w:tcPr>
+            <w:tcW w:type="dxa" w:w="2160"/>
+          </w:tcPr>
+          <w:p>
+            <w:r>
+              <w:t>Khóa chính</w:t>
+            </w:r>
+          </w:p>
+        </w:tc>
+      </w:tr>
+      <w:tr>
+        <w:tc>
+          <w:tcPr>
+            <w:tcW w:type="dxa" w:w="2160"/>
+          </w:tcPr>
+          <w:p>
+            <w:r>
+              <w:t>question</w:t>
+            </w:r>
+          </w:p>
+        </w:tc>
+        <w:tc>
+          <w:tcPr>
+            <w:tcW w:type="dxa" w:w="2160"/>
+          </w:tcPr>
+          <w:p>
+            <w:r>
+              <w:t>TEXT</w:t>
+            </w:r>
+          </w:p>
+        </w:tc>
+        <w:tc>
+          <w:tcPr>
+            <w:tcW w:type="dxa" w:w="2160"/>
+          </w:tcPr>
+          <w:p>
+            <w:r>
+              <w:t>NOT NULL</w:t>
+            </w:r>
+          </w:p>
+        </w:tc>
+        <w:tc>
+          <w:tcPr>
+            <w:tcW w:type="dxa" w:w="2160"/>
+          </w:tcPr>
+          <w:p>
+            <w:r>
+              <w:t>Nội dung câu hỏi Đúng/Sai</w:t>
+            </w:r>
+          </w:p>
+        </w:tc>
+      </w:tr>
+      <w:tr>
+        <w:tc>
+          <w:tcPr>
+            <w:tcW w:type="dxa" w:w="2160"/>
+          </w:tcPr>
+          <w:p>
+            <w:r>
+              <w:t>is_correct_true</w:t>
+            </w:r>
+          </w:p>
+        </w:tc>
+        <w:tc>
+          <w:tcPr>
+            <w:tcW w:type="dxa" w:w="2160"/>
+          </w:tcPr>
+          <w:p>
+            <w:r>
+              <w:t>BOOLEAN</w:t>
+            </w:r>
+          </w:p>
+        </w:tc>
+        <w:tc>
+          <w:tcPr>
+            <w:tcW w:type="dxa" w:w="2160"/>
+          </w:tcPr>
+          <w:p>
+            <w:r>
+              <w:t>NOT NULL</w:t>
+            </w:r>
+          </w:p>
+        </w:tc>
+        <w:tc>
+          <w:tcPr>
+            <w:tcW w:type="dxa" w:w="2160"/>
+          </w:tcPr>
+          <w:p>
+            <w:r>
+              <w:t>true = mệnh đề đúng, false = mệnh đề sai</w:t>
+            </w:r>
+          </w:p>
+        </w:tc>
+      </w:tr>
+      <w:tr>
+        <w:tc>
+          <w:tcPr>
+            <w:tcW w:type="dxa" w:w="2160"/>
+          </w:tcPr>
+          <w:p>
+            <w:r>
+              <w:t>explanation</w:t>
+            </w:r>
+          </w:p>
+        </w:tc>
+        <w:tc>
+          <w:tcPr>
+            <w:tcW w:type="dxa" w:w="2160"/>
+          </w:tcPr>
+          <w:p>
+            <w:r>
+              <w:t>TEXT</w:t>
+            </w:r>
+          </w:p>
+        </w:tc>
+        <w:tc>
+          <w:tcPr>
+            <w:tcW w:type="dxa" w:w="2160"/>
+          </w:tcPr>
+          <w:p>
+            <w:r>
+              <w:t>NULLABLE</w:t>
+            </w:r>
+          </w:p>
+        </w:tc>
+        <w:tc>
+          <w:tcPr>
+            <w:tcW w:type="dxa" w:w="2160"/>
+          </w:tcPr>
+          <w:p>
+            <w:r>
+              <w:t>Giải thích hiển khi trả lời sai</w:t>
+            </w:r>
+          </w:p>
+        </w:tc>
+      </w:tr>
+      <w:tr>
+        <w:tc>
+          <w:tcPr>
+            <w:tcW w:type="dxa" w:w="2160"/>
+          </w:tcPr>
+          <w:p>
+            <w:r>
+              <w:t>is_active</w:t>
+            </w:r>
+          </w:p>
+        </w:tc>
+        <w:tc>
+          <w:tcPr>
+            <w:tcW w:type="dxa" w:w="2160"/>
+          </w:tcPr>
+          <w:p>
+            <w:r>
+              <w:t>BOOLEAN</w:t>
+            </w:r>
+          </w:p>
+        </w:tc>
+        <w:tc>
+          <w:tcPr>
+            <w:tcW w:type="dxa" w:w="2160"/>
+          </w:tcPr>
+          <w:p>
+            <w:r>
+              <w:t>DEFAULT true</w:t>
+            </w:r>
+          </w:p>
+        </w:tc>
+        <w:tc>
+          <w:tcPr>
+            <w:tcW w:type="dxa" w:w="2160"/>
+          </w:tcPr>
+          <w:p>
+            <w:r>
+              <w:t>Bật/tắt câu hỏi</w:t>
+            </w:r>
+          </w:p>
+        </w:tc>
+      </w:tr>
+    </w:tbl>
+    <w:p/>
+    <w:p>
+      <w:pPr>
+        <w:pStyle w:val="IntenseQuote"/>
+      </w:pPr>
+      <w:r>
+        <w:t>Bảng game_sessions - Phiên chơi game hàng ngày:</w:t>
+      </w:r>
+    </w:p>
+    <w:tbl>
+      <w:tblPr>
+        <w:tblStyle w:val="TableGrid"/>
+        <w:tblW w:type="auto" w:w="0"/>
+        <w:tblLook w:firstColumn="1" w:firstRow="1" w:lastColumn="0" w:lastRow="0" w:noHBand="0" w:noVBand="1" w:val="04A0"/>
+      </w:tblPr>
+      <w:tblGrid>
+        <w:gridCol w:w="2160"/>
+        <w:gridCol w:w="2160"/>
+        <w:gridCol w:w="2160"/>
+        <w:gridCol w:w="2160"/>
+      </w:tblGrid>
+      <w:tr>
+        <w:tc>
+          <w:tcPr>
+            <w:tcW w:type="dxa" w:w="2160"/>
+          </w:tcPr>
+          <w:p>
+            <w:r>
+              <w:rPr>
+                <w:b/>
+              </w:rPr>
+              <w:t>Tên cột</w:t>
+            </w:r>
+          </w:p>
+        </w:tc>
+        <w:tc>
+          <w:tcPr>
+            <w:tcW w:type="dxa" w:w="2160"/>
+          </w:tcPr>
+          <w:p>
+            <w:r>
+              <w:rPr>
+                <w:b/>
+              </w:rPr>
+              <w:t>Kiểu dữ liệu</w:t>
+            </w:r>
+          </w:p>
+        </w:tc>
+        <w:tc>
+          <w:tcPr>
+            <w:tcW w:type="dxa" w:w="2160"/>
+          </w:tcPr>
+          <w:p>
+            <w:r>
+              <w:rPr>
+                <w:b/>
+              </w:rPr>
+              <w:t>Ràng buộc</w:t>
+            </w:r>
+          </w:p>
+        </w:tc>
+        <w:tc>
+          <w:tcPr>
+            <w:tcW w:type="dxa" w:w="2160"/>
+          </w:tcPr>
+          <w:p>
+            <w:r>
+              <w:rPr>
+                <w:b/>
+              </w:rPr>
+              <w:t>Mô tả</w:t>
+            </w:r>
+          </w:p>
+        </w:tc>
+      </w:tr>
+      <w:tr>
+        <w:tc>
+          <w:tcPr>
+            <w:tcW w:type="dxa" w:w="2160"/>
+          </w:tcPr>
+          <w:p>
+            <w:r>
+              <w:t>id</w:t>
+            </w:r>
+          </w:p>
+        </w:tc>
+        <w:tc>
+          <w:tcPr>
+            <w:tcW w:type="dxa" w:w="2160"/>
+          </w:tcPr>
+          <w:p>
+            <w:r>
+              <w:t>BIGINT UNSIGNED</w:t>
+            </w:r>
+          </w:p>
+        </w:tc>
+        <w:tc>
+          <w:tcPr>
+            <w:tcW w:type="dxa" w:w="2160"/>
+          </w:tcPr>
+          <w:p>
+            <w:r>
+              <w:t>PK, AUTO_INCREMENT</w:t>
+            </w:r>
+          </w:p>
+        </w:tc>
+        <w:tc>
+          <w:tcPr>
+            <w:tcW w:type="dxa" w:w="2160"/>
+          </w:tcPr>
+          <w:p>
+            <w:r>
+              <w:t>Khóa chính</w:t>
+            </w:r>
+          </w:p>
+        </w:tc>
+      </w:tr>
+      <w:tr>
+        <w:tc>
+          <w:tcPr>
+            <w:tcW w:type="dxa" w:w="2160"/>
+          </w:tcPr>
+          <w:p>
+            <w:r>
+              <w:t>user_id</w:t>
+            </w:r>
+          </w:p>
+        </w:tc>
+        <w:tc>
+          <w:tcPr>
+            <w:tcW w:type="dxa" w:w="2160"/>
+          </w:tcPr>
+          <w:p>
+            <w:r>
+              <w:t>BIGINT UNSIGNED</w:t>
+            </w:r>
+          </w:p>
+        </w:tc>
+        <w:tc>
+          <w:tcPr>
+            <w:tcW w:type="dxa" w:w="2160"/>
+          </w:tcPr>
+          <w:p>
+            <w:r>
+              <w:t>FK → users.id CASCADE</w:t>
+            </w:r>
+          </w:p>
+        </w:tc>
+        <w:tc>
+          <w:tcPr>
+            <w:tcW w:type="dxa" w:w="2160"/>
+          </w:tcPr>
+          <w:p>
+            <w:r>
+              <w:t>Người chơi</w:t>
+            </w:r>
+          </w:p>
+        </w:tc>
+      </w:tr>
+      <w:tr>
+        <w:tc>
+          <w:tcPr>
+            <w:tcW w:type="dxa" w:w="2160"/>
+          </w:tcPr>
+          <w:p>
+            <w:r>
+              <w:t>date</w:t>
+            </w:r>
+          </w:p>
+        </w:tc>
+        <w:tc>
+          <w:tcPr>
+            <w:tcW w:type="dxa" w:w="2160"/>
+          </w:tcPr>
+          <w:p>
+            <w:r>
+              <w:t>DATE</w:t>
+            </w:r>
+          </w:p>
+        </w:tc>
+        <w:tc>
+          <w:tcPr>
+            <w:tcW w:type="dxa" w:w="2160"/>
+          </w:tcPr>
+          <w:p>
+            <w:r>
+              <w:t>NOT NULL, UNIQUE(user_id, date)</w:t>
+            </w:r>
+          </w:p>
+        </w:tc>
+        <w:tc>
+          <w:tcPr>
+            <w:tcW w:type="dxa" w:w="2160"/>
+          </w:tcPr>
+          <w:p>
+            <w:r>
+              <w:t>Ngày chơi (đảm bảo 1 session/user/ngày)</w:t>
+            </w:r>
+          </w:p>
+        </w:tc>
+      </w:tr>
+      <w:tr>
+        <w:tc>
+          <w:tcPr>
+            <w:tcW w:type="dxa" w:w="2160"/>
+          </w:tcPr>
+          <w:p>
+            <w:r>
+              <w:t>questions_answered</w:t>
+            </w:r>
+          </w:p>
+        </w:tc>
+        <w:tc>
+          <w:tcPr>
+            <w:tcW w:type="dxa" w:w="2160"/>
+          </w:tcPr>
+          <w:p>
+            <w:r>
+              <w:t>INTEGER</w:t>
+            </w:r>
+          </w:p>
+        </w:tc>
+        <w:tc>
+          <w:tcPr>
+            <w:tcW w:type="dxa" w:w="2160"/>
+          </w:tcPr>
+          <w:p>
+            <w:r>
+              <w:t>DEFAULT 0</w:t>
+            </w:r>
+          </w:p>
+        </w:tc>
+        <w:tc>
+          <w:tcPr>
+            <w:tcW w:type="dxa" w:w="2160"/>
+          </w:tcPr>
+          <w:p>
+            <w:r>
+              <w:t>Số câu đã trả lời</w:t>
+            </w:r>
+          </w:p>
+        </w:tc>
+      </w:tr>
+      <w:tr>
+        <w:tc>
+          <w:tcPr>
+            <w:tcW w:type="dxa" w:w="2160"/>
+          </w:tcPr>
+          <w:p>
+            <w:r>
+              <w:t>correct_streak</w:t>
+            </w:r>
+          </w:p>
+        </w:tc>
+        <w:tc>
+          <w:tcPr>
+            <w:tcW w:type="dxa" w:w="2160"/>
+          </w:tcPr>
+          <w:p>
+            <w:r>
+              <w:t>INTEGER</w:t>
+            </w:r>
+          </w:p>
+        </w:tc>
+        <w:tc>
+          <w:tcPr>
+            <w:tcW w:type="dxa" w:w="2160"/>
+          </w:tcPr>
+          <w:p>
+            <w:r>
+              <w:t>DEFAULT 0</w:t>
+            </w:r>
+          </w:p>
+        </w:tc>
+        <w:tc>
+          <w:tcPr>
+            <w:tcW w:type="dxa" w:w="2160"/>
+          </w:tcPr>
+          <w:p>
+            <w:r>
+              <w:t>Chuỗi đúng liên tiếp hiện tại</w:t>
+            </w:r>
+          </w:p>
+        </w:tc>
+      </w:tr>
+      <w:tr>
+        <w:tc>
+          <w:tcPr>
+            <w:tcW w:type="dxa" w:w="2160"/>
+          </w:tcPr>
+          <w:p>
+            <w:r>
+              <w:t>total_correct</w:t>
+            </w:r>
+          </w:p>
+        </w:tc>
+        <w:tc>
+          <w:tcPr>
+            <w:tcW w:type="dxa" w:w="2160"/>
+          </w:tcPr>
+          <w:p>
+            <w:r>
+              <w:t>INTEGER</w:t>
+            </w:r>
+          </w:p>
+        </w:tc>
+        <w:tc>
+          <w:tcPr>
+            <w:tcW w:type="dxa" w:w="2160"/>
+          </w:tcPr>
+          <w:p>
+            <w:r>
+              <w:t>DEFAULT 0</w:t>
+            </w:r>
+          </w:p>
+        </w:tc>
+        <w:tc>
+          <w:tcPr>
+            <w:tcW w:type="dxa" w:w="2160"/>
+          </w:tcPr>
+          <w:p>
+            <w:r>
+              <w:t>Tổng câu đúng trong ngày</w:t>
+            </w:r>
+          </w:p>
+        </w:tc>
+      </w:tr>
+      <w:tr>
+        <w:tc>
+          <w:tcPr>
+            <w:tcW w:type="dxa" w:w="2160"/>
+          </w:tcPr>
+          <w:p>
+            <w:r>
+              <w:t>bonus_questions</w:t>
+            </w:r>
+          </w:p>
+        </w:tc>
+        <w:tc>
+          <w:tcPr>
+            <w:tcW w:type="dxa" w:w="2160"/>
+          </w:tcPr>
+          <w:p>
+            <w:r>
+              <w:t>INTEGER</w:t>
+            </w:r>
+          </w:p>
+        </w:tc>
+        <w:tc>
+          <w:tcPr>
+            <w:tcW w:type="dxa" w:w="2160"/>
+          </w:tcPr>
+          <w:p>
+            <w:r>
+              <w:t>DEFAULT 0</w:t>
+            </w:r>
+          </w:p>
+        </w:tc>
+        <w:tc>
+          <w:tcPr>
+            <w:tcW w:type="dxa" w:w="2160"/>
+          </w:tcPr>
+          <w:p>
+            <w:r>
+              <w:t>Lượt thưởng từ mua hàng</w:t>
+            </w:r>
+          </w:p>
+        </w:tc>
+      </w:tr>
+      <w:tr>
+        <w:tc>
+          <w:tcPr>
+            <w:tcW w:type="dxa" w:w="2160"/>
+          </w:tcPr>
+          <w:p>
+            <w:r>
+              <w:t>has_won_today</w:t>
+            </w:r>
+          </w:p>
+        </w:tc>
+        <w:tc>
+          <w:tcPr>
+            <w:tcW w:type="dxa" w:w="2160"/>
+          </w:tcPr>
+          <w:p>
+            <w:r>
+              <w:t>BOOLEAN</w:t>
+            </w:r>
+          </w:p>
+        </w:tc>
+        <w:tc>
+          <w:tcPr>
+            <w:tcW w:type="dxa" w:w="2160"/>
+          </w:tcPr>
+          <w:p>
+            <w:r>
+              <w:t>DEFAULT false</w:t>
+            </w:r>
+          </w:p>
+        </w:tc>
+        <w:tc>
+          <w:tcPr>
+            <w:tcW w:type="dxa" w:w="2160"/>
+          </w:tcPr>
+          <w:p>
+            <w:r>
+              <w:t>Đã trúng thưởng trong ngày chưa</w:t>
+            </w:r>
+          </w:p>
+        </w:tc>
+      </w:tr>
+    </w:tbl>
+    <w:p/>
+    <w:p>
+      <w:pPr>
+        <w:pStyle w:val="IntenseQuote"/>
+      </w:pPr>
+      <w:r>
+        <w:t>Bảng game_configs - Cấu hình game:</w:t>
+      </w:r>
+    </w:p>
+    <w:tbl>
+      <w:tblPr>
+        <w:tblStyle w:val="TableGrid"/>
+        <w:tblW w:type="auto" w:w="0"/>
+        <w:tblLook w:firstColumn="1" w:firstRow="1" w:lastColumn="0" w:lastRow="0" w:noHBand="0" w:noVBand="1" w:val="04A0"/>
+      </w:tblPr>
+      <w:tblGrid>
+        <w:gridCol w:w="2160"/>
+        <w:gridCol w:w="2160"/>
+        <w:gridCol w:w="2160"/>
+        <w:gridCol w:w="2160"/>
+      </w:tblGrid>
+      <w:tr>
+        <w:tc>
+          <w:tcPr>
+            <w:tcW w:type="dxa" w:w="2160"/>
+          </w:tcPr>
+          <w:p>
+            <w:r>
+              <w:rPr>
+                <w:b/>
+              </w:rPr>
+              <w:t>Tên cột</w:t>
+            </w:r>
+          </w:p>
+        </w:tc>
+        <w:tc>
+          <w:tcPr>
+            <w:tcW w:type="dxa" w:w="2160"/>
+          </w:tcPr>
+          <w:p>
+            <w:r>
+              <w:rPr>
+                <w:b/>
+              </w:rPr>
+              <w:t>Kiểu dữ liệu</w:t>
+            </w:r>
+          </w:p>
+        </w:tc>
+        <w:tc>
+          <w:tcPr>
+            <w:tcW w:type="dxa" w:w="2160"/>
+          </w:tcPr>
+          <w:p>
+            <w:r>
+              <w:rPr>
+                <w:b/>
+              </w:rPr>
+              <w:t>Ràng buộc</w:t>
+            </w:r>
+          </w:p>
+        </w:tc>
+        <w:tc>
+          <w:tcPr>
+            <w:tcW w:type="dxa" w:w="2160"/>
+          </w:tcPr>
+          <w:p>
+            <w:r>
+              <w:rPr>
+                <w:b/>
+              </w:rPr>
+              <w:t>Mô tả</w:t>
+            </w:r>
+          </w:p>
+        </w:tc>
+      </w:tr>
+      <w:tr>
+        <w:tc>
+          <w:tcPr>
+            <w:tcW w:type="dxa" w:w="2160"/>
+          </w:tcPr>
+          <w:p>
+            <w:r>
+              <w:t>id</w:t>
+            </w:r>
+          </w:p>
+        </w:tc>
+        <w:tc>
+          <w:tcPr>
+            <w:tcW w:type="dxa" w:w="2160"/>
+          </w:tcPr>
+          <w:p>
+            <w:r>
+              <w:t>BIGINT UNSIGNED</w:t>
+            </w:r>
+          </w:p>
+        </w:tc>
+        <w:tc>
+          <w:tcPr>
+            <w:tcW w:type="dxa" w:w="2160"/>
+          </w:tcPr>
+          <w:p>
+            <w:r>
+              <w:t>PK, AUTO_INCREMENT</w:t>
+            </w:r>
+          </w:p>
+        </w:tc>
+        <w:tc>
+          <w:tcPr>
+            <w:tcW w:type="dxa" w:w="2160"/>
+          </w:tcPr>
+          <w:p>
+            <w:r>
+              <w:t>Khóa chính</w:t>
+            </w:r>
+          </w:p>
+        </w:tc>
+      </w:tr>
+      <w:tr>
+        <w:tc>
+          <w:tcPr>
+            <w:tcW w:type="dxa" w:w="2160"/>
+          </w:tcPr>
+          <w:p>
+            <w:r>
+              <w:t>key</w:t>
+            </w:r>
+          </w:p>
+        </w:tc>
+        <w:tc>
+          <w:tcPr>
+            <w:tcW w:type="dxa" w:w="2160"/>
+          </w:tcPr>
+          <w:p>
+            <w:r>
+              <w:t>VARCHAR(255)</w:t>
+            </w:r>
+          </w:p>
+        </w:tc>
+        <w:tc>
+          <w:tcPr>
+            <w:tcW w:type="dxa" w:w="2160"/>
+          </w:tcPr>
+          <w:p>
+            <w:r>
+              <w:t>UNIQUE</w:t>
+            </w:r>
+          </w:p>
+        </w:tc>
+        <w:tc>
+          <w:tcPr>
+            <w:tcW w:type="dxa" w:w="2160"/>
+          </w:tcPr>
+          <w:p>
+            <w:r>
+              <w:t>Tên cấu hình (game_enabled, daily_questions, streak_required, win_probability, game_voucher_id)</w:t>
+            </w:r>
+          </w:p>
+        </w:tc>
+      </w:tr>
+      <w:tr>
+        <w:tc>
+          <w:tcPr>
+            <w:tcW w:type="dxa" w:w="2160"/>
+          </w:tcPr>
+          <w:p>
+            <w:r>
+              <w:t>value</w:t>
+            </w:r>
+          </w:p>
+        </w:tc>
+        <w:tc>
+          <w:tcPr>
+            <w:tcW w:type="dxa" w:w="2160"/>
+          </w:tcPr>
+          <w:p>
+            <w:r>
+              <w:t>TEXT</w:t>
+            </w:r>
+          </w:p>
+        </w:tc>
+        <w:tc>
+          <w:tcPr>
+            <w:tcW w:type="dxa" w:w="2160"/>
+          </w:tcPr>
+          <w:p>
+            <w:r>
+              <w:t>NULLABLE</w:t>
+            </w:r>
+          </w:p>
+        </w:tc>
+        <w:tc>
+          <w:tcPr>
+            <w:tcW w:type="dxa" w:w="2160"/>
+          </w:tcPr>
+          <w:p>
+            <w:r>
+              <w:t>Giá trị cấu hình</w:t>
+            </w:r>
+          </w:p>
+        </w:tc>
+      </w:tr>
+      <w:tr>
+        <w:tc>
+          <w:tcPr>
+            <w:tcW w:type="dxa" w:w="2160"/>
+          </w:tcPr>
+          <w:p>
+            <w:r>
+              <w:t>description</w:t>
+            </w:r>
+          </w:p>
+        </w:tc>
+        <w:tc>
+          <w:tcPr>
+            <w:tcW w:type="dxa" w:w="2160"/>
+          </w:tcPr>
+          <w:p>
+            <w:r>
+              <w:t>TEXT</w:t>
+            </w:r>
+          </w:p>
+        </w:tc>
+        <w:tc>
+          <w:tcPr>
+            <w:tcW w:type="dxa" w:w="2160"/>
+          </w:tcPr>
+          <w:p>
+            <w:r>
+              <w:t>NULLABLE</w:t>
+            </w:r>
+          </w:p>
+        </w:tc>
+        <w:tc>
+          <w:tcPr>
+            <w:tcW w:type="dxa" w:w="2160"/>
+          </w:tcPr>
+          <w:p>
+            <w:r>
+              <w:t>Mô tả cấu hình</w:t>
+            </w:r>
+          </w:p>
+        </w:tc>
+      </w:tr>
+    </w:tbl>
+    <w:p>
+      <w:pPr>
+        <w:pStyle w:val="Heading3"/>
+      </w:pPr>
+      <w:r>
+        <w:t>3.4.3. Sơ đồ lớp (Class Diagram) - Quan hệ Model</w:t>
+      </w:r>
+    </w:p>
+    <w:p>
+      <w:r>
+        <w:t>Sơ đồ lớp thể hiện 11 Eloquent Model chính và các mối quan hệ giữa chúng (belongsTo, hasMany):</w:t>
+      </w:r>
+    </w:p>
+    <w:p>
+      <w:pPr>
+        <w:jc w:val="center"/>
+      </w:pPr>
+      <w:r>
+        <w:drawing>
+          <wp:inline xmlns:a="http://schemas.openxmlformats.org/drawingml/2006/main" xmlns:pic="http://schemas.openxmlformats.org/drawingml/2006/picture">
+            <wp:extent cx="5486400" cy="3086525"/>
+            <wp:docPr id="17" name="Picture 17"/>
+            <wp:cNvGraphicFramePr>
+              <a:graphicFrameLocks noChangeAspect="1"/>
+            </wp:cNvGraphicFramePr>
+            <a:graphic>
+              <a:graphicData uri="http://schemas.openxmlformats.org/drawingml/2006/picture">
+                <pic:pic>
+                  <pic:nvPicPr>
+                    <pic:cNvPr id="0" name="d16.png"/>
+                    <pic:cNvPicPr/>
+                  </pic:nvPicPr>
+                  <pic:blipFill>
+                    <a:blip r:embed="rId25"/>
+                    <a:stretch>
+                      <a:fillRect/>
+                    </a:stretch>
+                  </pic:blipFill>
+                  <pic:spPr>
+                    <a:xfrm>
+                      <a:off x="0" y="0"/>
+                      <a:ext cx="5486400" cy="3086525"/>
+                    </a:xfrm>
+                    <a:prstGeom prst="rect"/>
+                  </pic:spPr>
+                </pic:pic>
+              </a:graphicData>
+            </a:graphic>
+          </wp:inline>
+        </w:drawing>
+      </w:r>
+    </w:p>
+    <w:p>
+      <w:pPr>
+        <w:jc w:val="center"/>
+      </w:pPr>
+      <w:r>
+        <w:rPr>
+          <w:i/>
+          <w:sz w:val="20"/>
+        </w:rPr>
+        <w:t>Hình: Sơ đồ lớp - Quan hệ Model Eloquent</w:t>
+      </w:r>
+    </w:p>
+    <w:p>
+      <w:r>
+        <w:t>Mô tả các quan hệ trong Class Diagram:</w:t>
+      </w:r>
+    </w:p>
+    <w:tbl>
+      <w:tblPr>
+        <w:tblStyle w:val="TableGrid"/>
+        <w:tblW w:type="auto" w:w="0"/>
+        <w:tblLook w:firstColumn="1" w:firstRow="1" w:lastColumn="0" w:lastRow="0" w:noHBand="0" w:noVBand="1" w:val="04A0"/>
+      </w:tblPr>
+      <w:tblGrid>
+        <w:gridCol w:w="2160"/>
+        <w:gridCol w:w="2160"/>
+        <w:gridCol w:w="2160"/>
+        <w:gridCol w:w="2160"/>
+      </w:tblGrid>
+      <w:tr>
+        <w:tc>
+          <w:tcPr>
+            <w:tcW w:type="dxa" w:w="2160"/>
+          </w:tcPr>
+          <w:p>
+            <w:r>
+              <w:rPr>
+                <w:b/>
+              </w:rPr>
               <w:t>Model</w:t>
             </w:r>
           </w:p>
@@ -9898,6 +12146,132 @@
           <w:p>
             <w:r>
               <w:t>Một chi tiết liên kết đến một sản phẩm.</w:t>
+            </w:r>
+          </w:p>
+        </w:tc>
+      </w:tr>
+      <w:tr>
+        <w:tc>
+          <w:tcPr>
+            <w:tcW w:type="dxa" w:w="2160"/>
+          </w:tcPr>
+          <w:p>
+            <w:r>
+              <w:t>GameSession</w:t>
+            </w:r>
+          </w:p>
+        </w:tc>
+        <w:tc>
+          <w:tcPr>
+            <w:tcW w:type="dxa" w:w="2160"/>
+          </w:tcPr>
+          <w:p>
+            <w:r>
+              <w:t>user()</w:t>
+            </w:r>
+          </w:p>
+        </w:tc>
+        <w:tc>
+          <w:tcPr>
+            <w:tcW w:type="dxa" w:w="2160"/>
+          </w:tcPr>
+          <w:p>
+            <w:r>
+              <w:t>belongsTo(User)</w:t>
+            </w:r>
+          </w:p>
+        </w:tc>
+        <w:tc>
+          <w:tcPr>
+            <w:tcW w:type="dxa" w:w="2160"/>
+          </w:tcPr>
+          <w:p>
+            <w:r>
+              <w:t>Một phiên game thuộc về một user. firstOrCreate theo (user_id + today).</w:t>
+            </w:r>
+          </w:p>
+        </w:tc>
+      </w:tr>
+      <w:tr>
+        <w:tc>
+          <w:tcPr>
+            <w:tcW w:type="dxa" w:w="2160"/>
+          </w:tcPr>
+          <w:p>
+            <w:r>
+              <w:t>GameConfig</w:t>
+            </w:r>
+          </w:p>
+        </w:tc>
+        <w:tc>
+          <w:tcPr>
+            <w:tcW w:type="dxa" w:w="2160"/>
+          </w:tcPr>
+          <w:p>
+            <w:r>
+              <w:t>get(key)</w:t>
+            </w:r>
+          </w:p>
+        </w:tc>
+        <w:tc>
+          <w:tcPr>
+            <w:tcW w:type="dxa" w:w="2160"/>
+          </w:tcPr>
+          <w:p>
+            <w:r>
+              <w:t>Static helper</w:t>
+            </w:r>
+          </w:p>
+        </w:tc>
+        <w:tc>
+          <w:tcPr>
+            <w:tcW w:type="dxa" w:w="2160"/>
+          </w:tcPr>
+          <w:p>
+            <w:r>
+              <w:t>Truy vấn giá trị cấu hình game theo key. Trả về default nếu không tìm thấy.</w:t>
+            </w:r>
+          </w:p>
+        </w:tc>
+      </w:tr>
+      <w:tr>
+        <w:tc>
+          <w:tcPr>
+            <w:tcW w:type="dxa" w:w="2160"/>
+          </w:tcPr>
+          <w:p>
+            <w:r>
+              <w:t>QuizQuestion</w:t>
+            </w:r>
+          </w:p>
+        </w:tc>
+        <w:tc>
+          <w:tcPr>
+            <w:tcW w:type="dxa" w:w="2160"/>
+          </w:tcPr>
+          <w:p>
+            <w:r>
+              <w:t>scopeActive()</w:t>
+            </w:r>
+          </w:p>
+        </w:tc>
+        <w:tc>
+          <w:tcPr>
+            <w:tcW w:type="dxa" w:w="2160"/>
+          </w:tcPr>
+          <w:p>
+            <w:r>
+              <w:t>Scope</w:t>
+            </w:r>
+          </w:p>
+        </w:tc>
+        <w:tc>
+          <w:tcPr>
+            <w:tcW w:type="dxa" w:w="2160"/>
+          </w:tcPr>
+          <w:p>
+            <w:r>
+              <w:t>Lọc câu hỏi đang active. Sử dụng: QuizQuestion::active()-&gt;inRandomOrder().</w:t>
             </w:r>
           </w:p>
         </w:tc>
@@ -11279,6 +13653,230 @@
     </w:p>
     <w:p>
       <w:pPr>
+        <w:pStyle w:val="Heading3"/>
+      </w:pPr>
+      <w:r>
+        <w:t>3.7.7. Module Mã giảm giá (Voucher)</w:t>
+      </w:r>
+    </w:p>
+    <w:p>
+      <w:r>
+        <w:t>Quy trình tạo và áp dụng mã giảm giá cho khách hàng:</w:t>
+      </w:r>
+    </w:p>
+    <w:p>
+      <w:r>
+        <w:rPr>
+          <w:b/>
+        </w:rPr>
+        <w:t xml:space="preserve">Bước 1: </w:t>
+      </w:r>
+      <w:r>
+        <w:t>Admin tạo voucher qua /admin/vouchers/create: nhập mã code (unique, viết hoa), chọn loại giảm (discount_type: "percent" hoặc "fixed"), nhập mức giảm (discount_value), đơn tối thiểu (min_order_amount), thời hạn (start_date/end_date), giới hạn lượt dùng (usage_limit), bật/tắt (is_active).</w:t>
+      </w:r>
+    </w:p>
+    <w:p>
+      <w:r>
+        <w:rPr>
+          <w:b/>
+        </w:rPr>
+        <w:t xml:space="preserve">Bước 2: </w:t>
+      </w:r>
+      <w:r>
+        <w:t>Khách hàng tại trang checkout (/checkout) nhập mã voucher vào ô input → POST /cart/voucher (CartController@applyVoucher).</w:t>
+      </w:r>
+    </w:p>
+    <w:p>
+      <w:r>
+        <w:rPr>
+          <w:b/>
+        </w:rPr>
+        <w:t xml:space="preserve">Bước 3: </w:t>
+      </w:r>
+      <w:r>
+        <w:t>Controller truy vấn Voucher::where("code", $code)-&gt;first(). Nếu không tìm thấy → redirect back kèm lỗi "Mã giảm giá không tồn tại".</w:t>
+      </w:r>
+    </w:p>
+    <w:p>
+      <w:r>
+        <w:rPr>
+          <w:b/>
+        </w:rPr>
+        <w:t xml:space="preserve">Bước 4: </w:t>
+      </w:r>
+      <w:r>
+        <w:t>Gọi $voucher-&gt;isValidForAmount($total) kiểm tra 5 điều kiện: (1) is_active = true, (2) used_count &lt; usage_limit (hoặc usage_limit = null), (3) start_date &lt;= now, (4) end_date &gt;= now, (5) total &gt;= min_order_amount.</w:t>
+      </w:r>
+    </w:p>
+    <w:p>
+      <w:r>
+        <w:rPr>
+          <w:b/>
+        </w:rPr>
+        <w:t xml:space="preserve">Bước 5: </w:t>
+      </w:r>
+      <w:r>
+        <w:t>Nếu mã hợp lệ: lưu object Voucher vào session(["voucher" =&gt; $voucher]). Giao diện checkout hiển thị: dòng "Tạm tính" (tổng gốc), dòng "Giảm giá (CODE)" (số tiền giảm, màu đỏ), dòng "Thành tiền" (tổng sau giảm, chữ lớn hơn).</w:t>
+      </w:r>
+    </w:p>
+    <w:p>
+      <w:r>
+        <w:rPr>
+          <w:b/>
+        </w:rPr>
+        <w:t xml:space="preserve">Bước 6: </w:t>
+      </w:r>
+      <w:r>
+        <w:t>Gỡ mã: Nút "Gỡ mã" gửi DELETE /cart/voucher (CartController@removeVoucher) → session()-&gt;forget("voucher") → redirect back.</w:t>
+      </w:r>
+    </w:p>
+    <w:p>
+      <w:r>
+        <w:rPr>
+          <w:b/>
+        </w:rPr>
+        <w:t xml:space="preserve">Bước 7: </w:t>
+      </w:r>
+      <w:r>
+        <w:t>Khi đặt hàng (OrderController@store): lấy voucher từ session → tính discountAmount bằng calculateDiscount($total) → finalTotal = total - discountAmount → lưu voucher_id và discount_amount vào bảng orders → tăng used_count += 1.</w:t>
+      </w:r>
+    </w:p>
+    <w:p>
+      <w:r>
+        <w:rPr>
+          <w:b/>
+        </w:rPr>
+        <w:t xml:space="preserve">Bước 8: </w:t>
+      </w:r>
+      <w:r>
+        <w:t>calculateDiscount($amount): Nếu discount_type = "percent" → discount = amount × (discount_value / 100). Nếu discount_type = "fixed" → discount = discount_value.</w:t>
+      </w:r>
+    </w:p>
+    <w:p>
+      <w:pPr>
+        <w:pStyle w:val="Heading3"/>
+      </w:pPr>
+      <w:r>
+        <w:t>3.7.8. Module Game Lắc Hũ tặng Voucher</w:t>
+      </w:r>
+    </w:p>
+    <w:p>
+      <w:r>
+        <w:t>Quy trình chi tiết của tính năng mini game quiz tương tác:</w:t>
+      </w:r>
+    </w:p>
+    <w:p>
+      <w:r>
+        <w:rPr>
+          <w:b/>
+        </w:rPr>
+        <w:t xml:space="preserve">Bước 1: </w:t>
+      </w:r>
+      <w:r>
+        <w:t>Admin cấu hình game tại /admin/game: bật/tắt game (game_enabled), số câu miễn phí/ngày (daily_questions, mặc định 5), số câu đúng liên tiếp để lắc hũ (streak_required, mặc định 3), tỷ lệ trúng % (win_probability, mặc định 30%), chọn voucher thưởng (game_voucher_id). Tất cả lưu vào bảng game_configs dạng key-value.</w:t>
+      </w:r>
+    </w:p>
+    <w:p>
+      <w:r>
+        <w:rPr>
+          <w:b/>
+        </w:rPr>
+        <w:t xml:space="preserve">Bước 2: </w:t>
+      </w:r>
+      <w:r>
+        <w:t>Admin quản lý ngân hàng câu hỏi tại /admin/game/questions: CRUD câu hỏi dạng Đúng/Sai (question + is_correct_true + explanation + is_active). Phân trang 10 câu/trang.</w:t>
+      </w:r>
+    </w:p>
+    <w:p>
+      <w:r>
+        <w:rPr>
+          <w:b/>
+        </w:rPr>
+        <w:t xml:space="preserve">Bước 3: </w:t>
+      </w:r>
+      <w:r>
+        <w:t>Khách hàng truy cập /game (yêu cầu đăng nhập): kiểm tra game_enabled == 1, nếu không redirect về home. Tạo GameSession::firstOrCreate(user_id + Carbon::today()) → đảm bảo mỗi ngày chỉ có 1 session.</w:t>
+      </w:r>
+    </w:p>
+    <w:p>
+      <w:r>
+        <w:rPr>
+          <w:b/>
+        </w:rPr>
+        <w:t xml:space="preserve">Bước 4: </w:t>
+      </w:r>
+      <w:r>
+        <w:t>Hiển thị giao diện: lượt còn lại (questionsAvailable = daily_questions + bonus_questions - questions_answered), chuỗi đúng hiện tại (correct_streak/streak_required), progress bar ngôi sao.</w:t>
+      </w:r>
+    </w:p>
+    <w:p>
+      <w:r>
+        <w:rPr>
+          <w:b/>
+        </w:rPr>
+        <w:t xml:space="preserve">Bước 5: </w:t>
+      </w:r>
+      <w:r>
+        <w:t>Nhấn "Bắt đầu" → POST /game/question: query QuizQuestion::active()-&gt;inRandomOrder()-&gt;first() → trả về JSON {id, question}.</w:t>
+      </w:r>
+    </w:p>
+    <w:p>
+      <w:r>
+        <w:rPr>
+          <w:b/>
+        </w:rPr>
+        <w:t xml:space="preserve">Bước 6: </w:t>
+      </w:r>
+      <w:r>
+        <w:t>Khách chọn "Đúng" hoặc "Sai" → POST /game/answer {question_id, answer}: so sánh answer == is_correct_true. Đúng: correct_streak += 1, total_correct += 1. Sai: correct_streak = 0. Cập nhật questions_answered += 1.</w:t>
+      </w:r>
+    </w:p>
+    <w:p>
+      <w:r>
+        <w:rPr>
+          <w:b/>
+        </w:rPr>
+        <w:t xml:space="preserve">Bước 7: </w:t>
+      </w:r>
+      <w:r>
+        <w:t>Nếu correct_streak &gt;= streak_required: client hiển animation lắc hũ (CSS @keyframes shake + hình hũ quà). Khách nhấn vào hũ → animation shake 2 giây.</w:t>
+      </w:r>
+    </w:p>
+    <w:p>
+      <w:r>
+        <w:rPr>
+          <w:b/>
+        </w:rPr>
+        <w:t xml:space="preserve">Bước 8: </w:t>
+      </w:r>
+      <w:r>
+        <w:t>Sau animation, POST /game/shake: server tạo rand(1,100), nếu &lt;= win_probability → trúng. Kiểm tra voucher (game_voucher_id): is_active và used_count &lt; usage_limit. Nếu hợp lệ → trả về {success: true, voucher: {code, discount_type, discount_value}}.</w:t>
+      </w:r>
+    </w:p>
+    <w:p>
+      <w:r>
+        <w:rPr>
+          <w:b/>
+        </w:rPr>
+        <w:t xml:space="preserve">Bước 9: </w:t>
+      </w:r>
+      <w:r>
+        <w:t>Trúng: hiển mã voucher code với nút "Sao chép mã" (navigator.clipboard.writeText). Không trúng: hiển "Chúc bạn may mắn lần sau". Cả hai đều reset correct_streak = 0.</w:t>
+      </w:r>
+    </w:p>
+    <w:p>
+      <w:r>
+        <w:rPr>
+          <w:b/>
+        </w:rPr>
+        <w:t xml:space="preserve">Bước 10: </w:t>
+      </w:r>
+      <w:r>
+        <w:t>Bonus lượt chơi: Khi Admin chuyển đơn hàng sang status=completed (OrderController@updateStatus) → tăng bonus_questions += 1 trong GameSession của user ngày hôm đó → khách có thêm lượt chơi.</w:t>
+      </w:r>
+    </w:p>
+    <w:p>
+      <w:pPr>
         <w:pStyle w:val="Heading2"/>
       </w:pPr>
       <w:r>
@@ -11298,7 +13896,7 @@
         <w:drawing>
           <wp:inline xmlns:a="http://schemas.openxmlformats.org/drawingml/2006/main" xmlns:pic="http://schemas.openxmlformats.org/drawingml/2006/picture">
             <wp:extent cx="5486400" cy="4871677"/>
-            <wp:docPr id="17" name="Picture 17"/>
+            <wp:docPr id="18" name="Picture 18"/>
             <wp:cNvGraphicFramePr>
               <a:graphicFrameLocks noChangeAspect="1"/>
             </wp:cNvGraphicFramePr>
@@ -11310,7 +13908,7 @@
                     <pic:cNvPicPr/>
                   </pic:nvPicPr>
                   <pic:blipFill>
-                    <a:blip r:embed="rId25"/>
+                    <a:blip r:embed="rId26"/>
                     <a:stretch>
                       <a:fillRect/>
                     </a:stretch>

</xml_diff>